<commit_message>
Added final document and pdf
Final document and pdf
</commit_message>
<xml_diff>
--- a/Final_Project_Williams_John3.docx
+++ b/Final_Project_Williams_John3.docx
@@ -705,7 +705,35 @@
         <w:rPr>
           <w:rFonts w:asciiTheme="minorHAnsi" w:hAnsiTheme="minorHAnsi"/>
         </w:rPr>
-        <w:t xml:space="preserve"> We utilize the tidyverse and dplyr ecosystems for data manipulation and the haven or csv utilities for data ingestion.</w:t>
+        <w:t xml:space="preserve"> We utilize the </w:t>
+      </w:r>
+      <w:proofErr w:type="spellStart"/>
+      <w:r>
+        <w:rPr>
+          <w:rFonts w:asciiTheme="minorHAnsi" w:hAnsiTheme="minorHAnsi"/>
+        </w:rPr>
+        <w:t>tidyverse</w:t>
+      </w:r>
+      <w:proofErr w:type="spellEnd"/>
+      <w:r>
+        <w:rPr>
+          <w:rFonts w:asciiTheme="minorHAnsi" w:hAnsiTheme="minorHAnsi"/>
+        </w:rPr>
+        <w:t xml:space="preserve"> and </w:t>
+      </w:r>
+      <w:proofErr w:type="spellStart"/>
+      <w:r>
+        <w:rPr>
+          <w:rFonts w:asciiTheme="minorHAnsi" w:hAnsiTheme="minorHAnsi"/>
+        </w:rPr>
+        <w:t>dplyr</w:t>
+      </w:r>
+      <w:proofErr w:type="spellEnd"/>
+      <w:r>
+        <w:rPr>
+          <w:rFonts w:asciiTheme="minorHAnsi" w:hAnsiTheme="minorHAnsi"/>
+        </w:rPr>
+        <w:t xml:space="preserve"> ecosystems for data manipulation and the haven or csv utilities for data ingestion.</w:t>
       </w:r>
     </w:p>
     <w:p>
@@ -971,9 +999,11 @@
       <w:r>
         <w:t>This hypothesis is informed by the documented "gender gap" in economic expectations. Research suggests that women often perceive fewer opportunities for advancement due to persistent structural barriers and the gender pay gap (</w:t>
       </w:r>
+      <w:proofErr w:type="spellStart"/>
       <w:r>
         <w:t>Bjuggren</w:t>
       </w:r>
+      <w:proofErr w:type="spellEnd"/>
       <w:r>
         <w:t xml:space="preserve"> et al., 20</w:t>
       </w:r>
@@ -1774,8 +1804,13 @@
       </w:r>
     </w:p>
     <w:p>
-      <w:r>
-        <w:t>Bjuggren, C. M., &amp; Elert, N. (2019). Gender differences in optimism. </w:t>
+      <w:proofErr w:type="spellStart"/>
+      <w:r>
+        <w:t>Bjuggren</w:t>
+      </w:r>
+      <w:proofErr w:type="spellEnd"/>
+      <w:r>
+        <w:t>, C. M., &amp; Elert, N. (2019). Gender differences in optimism. </w:t>
       </w:r>
       <w:r>
         <w:rPr>
@@ -3438,7 +3473,15 @@
         <w:t>that its impact on life expectancy often reaches a point of diminishing returns in high-income nations compared with broader social determinants such as</w:t>
       </w:r>
       <w:r>
-        <w:t xml:space="preserve"> education (Ranabhat et al., 2018).</w:t>
+        <w:t xml:space="preserve"> education (</w:t>
+      </w:r>
+      <w:proofErr w:type="spellStart"/>
+      <w:r>
+        <w:t>Ranabhat</w:t>
+      </w:r>
+      <w:proofErr w:type="spellEnd"/>
+      <w:r>
+        <w:t xml:space="preserve"> et al., 2018).</w:t>
       </w:r>
     </w:p>
     <w:p>
@@ -4604,8 +4647,13 @@
       </w:hyperlink>
     </w:p>
     <w:p>
-      <w:r>
-        <w:t xml:space="preserve">Ranabhat, C. L., Jakovljevic, M., Dhimal, M., &amp; Kim, C. B. (2018). Structural determinants of health outcomes: State of global health equity, 1990–2015. </w:t>
+      <w:proofErr w:type="spellStart"/>
+      <w:r>
+        <w:t>Ranabhat</w:t>
+      </w:r>
+      <w:proofErr w:type="spellEnd"/>
+      <w:r>
+        <w:t xml:space="preserve">, C. L., Jakovljevic, M., Dhimal, M., &amp; Kim, C. B. (2018). Structural determinants of health outcomes: State of global health equity, 1990–2015. </w:t>
       </w:r>
       <w:r>
         <w:rPr>
@@ -4719,7 +4767,15 @@
         <w:t>,</w:t>
       </w:r>
       <w:r>
-        <w:t xml:space="preserve"> which then facilitate a higher quality of life (Araki, 2022). However, education also provides "non-pecuniary" benefits—such as increased personal control, social status, and cognitive resources—that contribute to happiness independently of money (Ross &amp; Mirowsky, 2013). Prior empirical research suggests that while education and happiness are strongly correlated, the relationship is complex; income acts as a functional mechanism that translates academic success into material security, thereby reducing life stress and increasing subjective well-being (Cuñado &amp; de Gracia, 2012).</w:t>
+        <w:t xml:space="preserve"> which then facilitate a higher quality of life (Araki, 2022). However, education also provides "non-pecuniary" benefits—such as increased personal control, social status, and cognitive resources—that contribute to happiness independently of money (Ross &amp; Mirowsky, 2013). Prior empirical research suggests that while education and happiness are strongly correlated, the relationship is complex; income acts as a functional mechanism that translates academic success into material security, thereby reducing life stress and increasing subjective well-being (</w:t>
+      </w:r>
+      <w:proofErr w:type="spellStart"/>
+      <w:r>
+        <w:t>Cuñado</w:t>
+      </w:r>
+      <w:proofErr w:type="spellEnd"/>
+      <w:r>
+        <w:t xml:space="preserve"> &amp; de Gracia, 2012).</w:t>
       </w:r>
     </w:p>
     <w:p>
@@ -4780,7 +4836,23 @@
         <w:t>The Model</w:t>
       </w:r>
       <w:r>
-        <w:t>: We tested the $X \rightarrow M \rightarrow Y$ pathway:</w:t>
+        <w:t>: We tested the $X \</w:t>
+      </w:r>
+      <w:proofErr w:type="spellStart"/>
+      <w:r>
+        <w:t>rightarrow</w:t>
+      </w:r>
+      <w:proofErr w:type="spellEnd"/>
+      <w:r>
+        <w:t xml:space="preserve"> M \</w:t>
+      </w:r>
+      <w:proofErr w:type="spellStart"/>
+      <w:r>
+        <w:t>rightarrow</w:t>
+      </w:r>
+      <w:proofErr w:type="spellEnd"/>
+      <w:r>
+        <w:t xml:space="preserve"> Y$ pathway:</w:t>
       </w:r>
     </w:p>
     <w:p>
@@ -4799,7 +4871,15 @@
         <w:t>Path A</w:t>
       </w:r>
       <w:r>
-        <w:t>: Education ($X$) $\rightarrow$ Income ($M$).</w:t>
+        <w:t>: Education ($X$) $\</w:t>
+      </w:r>
+      <w:proofErr w:type="spellStart"/>
+      <w:r>
+        <w:t>rightarrow</w:t>
+      </w:r>
+      <w:proofErr w:type="spellEnd"/>
+      <w:r>
+        <w:t>$ Income ($M$).</w:t>
       </w:r>
     </w:p>
     <w:p>
@@ -4818,7 +4898,15 @@
         <w:t>Path B</w:t>
       </w:r>
       <w:r>
-        <w:t>: Income ($M$) $\rightarrow$ Happiness ($Y$) while controlling for Education.</w:t>
+        <w:t>: Income ($M$) $\</w:t>
+      </w:r>
+      <w:proofErr w:type="spellStart"/>
+      <w:r>
+        <w:t>rightarrow</w:t>
+      </w:r>
+      <w:proofErr w:type="spellEnd"/>
+      <w:r>
+        <w:t>$ Happiness ($Y$) while controlling for Education.</w:t>
       </w:r>
     </w:p>
     <w:p>
@@ -4850,7 +4938,15 @@
         <w:t>Reverse Coding</w:t>
       </w:r>
       <w:r>
-        <w:t>: The GSS originally codes "1" as "Very Happy." We reverse-coded this into happy_rev so that higher scores represent higher levels of happiness (1 = Not Too Happy, 3 = Very Happy).</w:t>
+        <w:t xml:space="preserve">: The GSS originally codes "1" as "Very Happy." We reverse-coded this into </w:t>
+      </w:r>
+      <w:proofErr w:type="spellStart"/>
+      <w:r>
+        <w:t>happy_rev</w:t>
+      </w:r>
+      <w:proofErr w:type="spellEnd"/>
+      <w:r>
+        <w:t xml:space="preserve"> so that higher scores represent higher levels of happiness (1 = Not Too Happy, 3 = Very Happy).</w:t>
       </w:r>
     </w:p>
     <w:p>
@@ -5536,8 +5632,13 @@
       </w:r>
     </w:p>
     <w:p>
-      <w:r>
-        <w:t xml:space="preserve">Cuñado, J., &amp; de Gracia, F. P. (2012). Does education affect happiness? Evidence for Spain. </w:t>
+      <w:proofErr w:type="spellStart"/>
+      <w:r>
+        <w:t>Cuñado</w:t>
+      </w:r>
+      <w:proofErr w:type="spellEnd"/>
+      <w:r>
+        <w:t xml:space="preserve">, J., &amp; de Gracia, F. P. (2012). Does education affect happiness? Evidence for Spain. </w:t>
       </w:r>
       <w:r>
         <w:rPr>
@@ -5565,7 +5666,15 @@
     </w:p>
     <w:p>
       <w:r>
-        <w:t>Ross, C. E., &amp; Mirowsky, J.</w:t>
+        <w:t xml:space="preserve">Ross, C. E., &amp; </w:t>
+      </w:r>
+      <w:proofErr w:type="spellStart"/>
+      <w:r>
+        <w:t>Mirowsky</w:t>
+      </w:r>
+      <w:proofErr w:type="spellEnd"/>
+      <w:r>
+        <w:t>, J.</w:t>
       </w:r>
       <w:r>
         <w:t xml:space="preserve"> (2013). Explaining the social gradient in health: Economic resources, psychology, and lifestyle. In </w:t>
@@ -5664,7 +5773,15 @@
         <w:t>Rationale:</w:t>
       </w:r>
       <w:r>
-        <w:t xml:space="preserve"> This analysis is grounded in "Social Capital Theory," which argues that the strength of one’s community and safety nets is just as critical to well-being as economic wealth (Helliwell et al., 2018). While individual traits matter, "Place Effects" suggest that regional political stability, cultural norms, and shared history create a baseline "floor" for happiness that varies across the globe (Veenhoven &amp; Berg, 2013). Research into global stratification indicates that regions like North America and Northern Europe often report higher baseline satisfaction</w:t>
+        <w:t xml:space="preserve"> This analysis is grounded in "Social Capital Theory," which argues that the strength of one’s community and safety nets is just as critical to well-being as economic wealth (Helliwell et al., 2018). While individual traits matter, "Place Effects" suggest that regional political stability, cultural norms, and shared history create a baseline "floor" for happiness that varies across the globe (</w:t>
+      </w:r>
+      <w:proofErr w:type="spellStart"/>
+      <w:r>
+        <w:t>Veenhoven</w:t>
+      </w:r>
+      <w:proofErr w:type="spellEnd"/>
+      <w:r>
+        <w:t xml:space="preserve"> &amp; Berg, 2013). Research into global stratification indicates that regions like North America and Northern Europe often report higher baseline satisfaction</w:t>
       </w:r>
       <w:r>
         <w:t xml:space="preserve">; </w:t>
@@ -6721,8 +6838,13 @@
       </w:hyperlink>
     </w:p>
     <w:p>
-      <w:r>
-        <w:t xml:space="preserve">Veenhoven, R., &amp; Berg, M. (2013). Has modernization gone too far? Happiness and modernity in 141 contemporary nations. </w:t>
+      <w:proofErr w:type="spellStart"/>
+      <w:r>
+        <w:t>Veenhoven</w:t>
+      </w:r>
+      <w:proofErr w:type="spellEnd"/>
+      <w:r>
+        <w:t xml:space="preserve">, R., &amp; Berg, M. (2013). Has modernization gone too far? Happiness and modernity in 141 contemporary nations. </w:t>
       </w:r>
       <w:r>
         <w:rPr>
@@ -6827,7 +6949,15 @@
         <w:t>Rationale</w:t>
       </w:r>
       <w:r>
-        <w:t>: This analysis is based on the "Latent Variable Model," which suggests that observed indicators like GDP or employment rates are actually visible "symptoms" of an unobservable, deeper quality of life (Bollen, 2002). In developmental economics, research indicates that various dimensions of well-being are "multi-collinear," meaning they tend to rise and fall together because they are driven by the same institutional and social foundations (Stiglitz et al., 2018). Furthermore, exploratory studies of the Better Life Index have consistently shown that material conditions and subjective satisfaction load onto a common dimension of "General Well-Being" (Mizobuchi, 2014).</w:t>
+        <w:t>: This analysis is based on the "Latent Variable Model," which suggests that observed indicators like GDP or employment rates are actually visible "symptoms" of an unobservable, deeper quality of life (Bollen, 2002). In developmental economics, research indicates that various dimensions of well-being are "multi-collinear," meaning they tend to rise and fall together because they are driven by the same institutional and social foundations (Stiglitz et al., 2018). Furthermore, exploratory studies of the Better Life Index have consistently shown that material conditions and subjective satisfaction load onto a common dimension of "General Well-Being" (</w:t>
+      </w:r>
+      <w:proofErr w:type="spellStart"/>
+      <w:r>
+        <w:t>Mizobuchi</w:t>
+      </w:r>
+      <w:proofErr w:type="spellEnd"/>
+      <w:r>
+        <w:t>, 2014).</w:t>
       </w:r>
     </w:p>
     <w:p>
@@ -7821,8 +7951,13 @@
       </w:hyperlink>
     </w:p>
     <w:p>
-      <w:r>
-        <w:t xml:space="preserve">Mizobuchi, H. (2014). Measuring world better life frontier: A composite indicator for OECD Better Life Index. </w:t>
+      <w:proofErr w:type="spellStart"/>
+      <w:r>
+        <w:t>Mizobuchi</w:t>
+      </w:r>
+      <w:proofErr w:type="spellEnd"/>
+      <w:r>
+        <w:t xml:space="preserve">, H. (2014). Measuring world better life frontier: A composite indicator for OECD Better Life Index. </w:t>
       </w:r>
       <w:r>
         <w:rPr>
@@ -8157,8 +8292,13 @@
       <w:pPr>
         <w:ind w:left="720" w:hanging="720"/>
       </w:pPr>
-      <w:r>
-        <w:t>Bjuggren, C. M., &amp; Elert, N. (2019). Gender differences in optimism. </w:t>
+      <w:proofErr w:type="spellStart"/>
+      <w:r>
+        <w:t>Bjuggren</w:t>
+      </w:r>
+      <w:proofErr w:type="spellEnd"/>
+      <w:r>
+        <w:t>, C. M., &amp; Elert, N. (2019). Gender differences in optimism. </w:t>
       </w:r>
       <w:r>
         <w:rPr>
@@ -8246,8 +8386,13 @@
       <w:pPr>
         <w:ind w:left="720" w:hanging="720"/>
       </w:pPr>
-      <w:r>
-        <w:t xml:space="preserve">Cuñado, J., &amp; de Gracia, F. P. (2012). Does education affect happiness? Evidence for Spain. </w:t>
+      <w:proofErr w:type="spellStart"/>
+      <w:r>
+        <w:t>Cuñado</w:t>
+      </w:r>
+      <w:proofErr w:type="spellEnd"/>
+      <w:r>
+        <w:t xml:space="preserve">, J., &amp; de Gracia, F. P. (2012). Does education affect happiness? Evidence for Spain. </w:t>
       </w:r>
       <w:r>
         <w:rPr>
@@ -8482,8 +8627,13 @@
       <w:pPr>
         <w:ind w:left="720" w:hanging="720"/>
       </w:pPr>
-      <w:r>
-        <w:t xml:space="preserve">Mizobuchi, H. (2014). Measuring world better life frontier: A composite indicator for OECD Better Life Index. </w:t>
+      <w:proofErr w:type="spellStart"/>
+      <w:r>
+        <w:t>Mizobuchi</w:t>
+      </w:r>
+      <w:proofErr w:type="spellEnd"/>
+      <w:r>
+        <w:t xml:space="preserve">, H. (2014). Measuring world better life frontier: A composite indicator for OECD Better Life Index. </w:t>
       </w:r>
       <w:r>
         <w:rPr>
@@ -8552,8 +8702,13 @@
       <w:pPr>
         <w:ind w:left="720" w:hanging="720"/>
       </w:pPr>
-      <w:r>
-        <w:t>Ranabhat, C. L., Jakovljevic, M., Dhimal, M., &amp; Kim, C. B.</w:t>
+      <w:proofErr w:type="spellStart"/>
+      <w:r>
+        <w:t>Ranabhat</w:t>
+      </w:r>
+      <w:proofErr w:type="spellEnd"/>
+      <w:r>
+        <w:t>, C. L., Jakovljevic, M., Dhimal, M., &amp; Kim, C. B.</w:t>
       </w:r>
       <w:r>
         <w:t xml:space="preserve"> (2018). Structural determinants of health outcomes: State of global health equity, 1990–2015. </w:t>
@@ -8592,7 +8747,15 @@
         <w:ind w:left="720" w:hanging="720"/>
       </w:pPr>
       <w:r>
-        <w:t>Ross, C. E., &amp; Mirowsky, J.</w:t>
+        <w:t xml:space="preserve">Ross, C. E., &amp; </w:t>
+      </w:r>
+      <w:proofErr w:type="spellStart"/>
+      <w:r>
+        <w:t>Mirowsky</w:t>
+      </w:r>
+      <w:proofErr w:type="spellEnd"/>
+      <w:r>
+        <w:t>, J.</w:t>
       </w:r>
       <w:r>
         <w:t xml:space="preserve"> (2013). Explaining the social gradient in health: Economic resources, psychology, and lifestyle. In </w:t>
@@ -8644,8 +8807,13 @@
       <w:pPr>
         <w:ind w:left="720" w:hanging="720"/>
       </w:pPr>
-      <w:r>
-        <w:t xml:space="preserve">Veenhoven, R., &amp; Berg, M. (2013). Has modernization gone too far? Happiness and modernity in 141 contemporary nations. </w:t>
+      <w:proofErr w:type="spellStart"/>
+      <w:r>
+        <w:t>Veenhoven</w:t>
+      </w:r>
+      <w:proofErr w:type="spellEnd"/>
+      <w:r>
+        <w:t xml:space="preserve">, R., &amp; Berg, M. (2013). Has modernization gone too far? Happiness and modernity in 141 contemporary nations. </w:t>
       </w:r>
       <w:r>
         <w:rPr>
@@ -8743,15 +8911,20 @@
       <w:r>
         <w:t xml:space="preserve">Final Paper &lt;- </w:t>
       </w:r>
-      <w:r>
-        <w:t>https://github.com/jdwbmc/DSCI609/blob/main/Final_Project_Williams_John2.docx</w:t>
-      </w:r>
+      <w:hyperlink r:id="rId28" w:history="1">
+        <w:r>
+          <w:rPr>
+            <w:rStyle w:val="Hyperlink"/>
+          </w:rPr>
+          <w:t>https://github.com/jdwbmc/DSCI609/blob/main/Final_Project_Williams_John3.docx</w:t>
+        </w:r>
+      </w:hyperlink>
     </w:p>
     <w:p>
       <w:r>
         <w:t xml:space="preserve">GSS data &lt;- </w:t>
       </w:r>
-      <w:hyperlink r:id="rId28" w:history="1">
+      <w:hyperlink r:id="rId29" w:history="1">
         <w:r>
           <w:rPr>
             <w:rStyle w:val="Hyperlink"/>
@@ -8764,7 +8937,7 @@
       <w:r>
         <w:t xml:space="preserve">OCED data &lt;- </w:t>
       </w:r>
-      <w:hyperlink r:id="rId29" w:history="1">
+      <w:hyperlink r:id="rId30" w:history="1">
         <w:r>
           <w:rPr>
             <w:rStyle w:val="Hyperlink"/>
@@ -8777,7 +8950,7 @@
       <w:r>
         <w:t xml:space="preserve">WSI Data &lt;- </w:t>
       </w:r>
-      <w:hyperlink r:id="rId30" w:history="1">
+      <w:hyperlink r:id="rId31" w:history="1">
         <w:r>
           <w:rPr>
             <w:rStyle w:val="Hyperlink"/>
@@ -8790,7 +8963,7 @@
       <w:r>
         <w:t xml:space="preserve">Batch 5 Data &lt;- </w:t>
       </w:r>
-      <w:hyperlink r:id="rId31" w:history="1">
+      <w:hyperlink r:id="rId32" w:history="1">
         <w:r>
           <w:rPr>
             <w:rStyle w:val="Hyperlink"/>
@@ -8803,7 +8976,7 @@
       <w:r>
         <w:t xml:space="preserve">R Code &lt;- </w:t>
       </w:r>
-      <w:hyperlink r:id="rId32" w:history="1">
+      <w:hyperlink r:id="rId33" w:history="1">
         <w:r>
           <w:rPr>
             <w:rStyle w:val="Hyperlink"/>
@@ -8816,16 +8989,10 @@
       <w:r>
         <w:t xml:space="preserve">Geography of Happiness PowerPoint &lt;- </w:t>
       </w:r>
-      <w:hyperlink r:id="rId33" w:history="1">
-        <w:r>
-          <w:rPr>
-            <w:rStyle w:val="Hyperlink"/>
-          </w:rPr>
-          <w:t>https://github.com/jdwbmc/DSCI609/blob/main/Geography_of_Happiness.pptx</w:t>
-        </w:r>
-      </w:hyperlink>
-    </w:p>
-    <w:p/>
+      <w:r>
+        <w:t>https://github.com/jdwbmc/DSCI609/blob/main/Geography_of_Happiness2.pptx</w:t>
+      </w:r>
+    </w:p>
     <w:p>
       <w:pPr>
         <w:rPr>
@@ -8910,8 +9077,13 @@
         <w:spacing w:after="0"/>
       </w:pPr>
       <w:r>
-        <w:t>output: pdf_document</w:t>
-      </w:r>
+        <w:t xml:space="preserve">output: </w:t>
+      </w:r>
+      <w:proofErr w:type="spellStart"/>
+      <w:r>
+        <w:t>pdf_document</w:t>
+      </w:r>
+      <w:proofErr w:type="spellEnd"/>
     </w:p>
     <w:p>
       <w:pPr>
@@ -8938,8 +9110,21 @@
       <w:pPr>
         <w:spacing w:after="0"/>
       </w:pPr>
-      <w:r>
-        <w:t>knitr::opts_chunk$set(echo = TRUE)</w:t>
+      <w:proofErr w:type="spellStart"/>
+      <w:r>
+        <w:t>knitr</w:t>
+      </w:r>
+      <w:proofErr w:type="spellEnd"/>
+      <w:r>
+        <w:t>::</w:t>
+      </w:r>
+      <w:proofErr w:type="spellStart"/>
+      <w:r>
+        <w:t>opts_chunk$set</w:t>
+      </w:r>
+      <w:proofErr w:type="spellEnd"/>
+      <w:r>
+        <w:t>(echo = TRUE)</w:t>
       </w:r>
     </w:p>
     <w:p>
@@ -8997,15 +9182,31 @@
         <w:spacing w:after="0"/>
       </w:pPr>
       <w:r>
-        <w:t>library(dplyr)</w:t>
-      </w:r>
-    </w:p>
-    <w:p>
-      <w:pPr>
-        <w:spacing w:after="0"/>
-      </w:pPr>
-      <w:r>
-        <w:t>library(tidyverse)</w:t>
+        <w:t>library(</w:t>
+      </w:r>
+      <w:proofErr w:type="spellStart"/>
+      <w:r>
+        <w:t>dplyr</w:t>
+      </w:r>
+      <w:proofErr w:type="spellEnd"/>
+      <w:r>
+        <w:t>)</w:t>
+      </w:r>
+    </w:p>
+    <w:p>
+      <w:pPr>
+        <w:spacing w:after="0"/>
+      </w:pPr>
+      <w:r>
+        <w:t>library(</w:t>
+      </w:r>
+      <w:proofErr w:type="spellStart"/>
+      <w:r>
+        <w:t>tidyverse</w:t>
+      </w:r>
+      <w:proofErr w:type="spellEnd"/>
+      <w:r>
+        <w:t>)</w:t>
       </w:r>
     </w:p>
     <w:p>
@@ -9041,16 +9242,34 @@
       <w:pPr>
         <w:spacing w:after="0"/>
       </w:pPr>
-      <w:r>
-        <w:t>setwd("C:/Users/Owner/Documents/BallState/DSCI-609 SocSci/Paper")</w:t>
-      </w:r>
-    </w:p>
-    <w:p>
-      <w:pPr>
-        <w:spacing w:after="0"/>
-      </w:pPr>
-      <w:r>
-        <w:t>gss_data &lt;- read.csv("gss_data.csv")</w:t>
+      <w:proofErr w:type="spellStart"/>
+      <w:r>
+        <w:t>setwd</w:t>
+      </w:r>
+      <w:proofErr w:type="spellEnd"/>
+      <w:r>
+        <w:t xml:space="preserve">("C:/Users/Owner/Documents/BallState/DSCI-609 </w:t>
+      </w:r>
+      <w:proofErr w:type="spellStart"/>
+      <w:r>
+        <w:t>SocSci</w:t>
+      </w:r>
+      <w:proofErr w:type="spellEnd"/>
+      <w:r>
+        <w:t>/Paper")</w:t>
+      </w:r>
+    </w:p>
+    <w:p>
+      <w:pPr>
+        <w:spacing w:after="0"/>
+      </w:pPr>
+      <w:proofErr w:type="spellStart"/>
+      <w:r>
+        <w:t>gss_data</w:t>
+      </w:r>
+      <w:proofErr w:type="spellEnd"/>
+      <w:r>
+        <w:t xml:space="preserve"> &lt;- read.csv("gss_data.csv")</w:t>
       </w:r>
     </w:p>
     <w:p>
@@ -9071,20 +9290,68 @@
         <w:spacing w:after="0"/>
       </w:pPr>
       <w:r>
-        <w:t>gss_data1 &lt;- gss_data[, colSums(is.na(gss_data)) &lt; nrow(gss_data)]</w:t>
-      </w:r>
-    </w:p>
-    <w:p>
-      <w:pPr>
-        <w:spacing w:after="0"/>
-      </w:pPr>
-    </w:p>
-    <w:p>
-      <w:pPr>
-        <w:spacing w:after="0"/>
-      </w:pPr>
-      <w:r>
-        <w:t>gss_data1$sex &lt;- as_factor(gss_data1$sex)</w:t>
+        <w:t xml:space="preserve">gss_data1 &lt;- </w:t>
+      </w:r>
+      <w:proofErr w:type="spellStart"/>
+      <w:r>
+        <w:t>gss_data</w:t>
+      </w:r>
+      <w:proofErr w:type="spellEnd"/>
+      <w:r>
+        <w:t xml:space="preserve">[, </w:t>
+      </w:r>
+      <w:proofErr w:type="spellStart"/>
+      <w:r>
+        <w:t>colSums</w:t>
+      </w:r>
+      <w:proofErr w:type="spellEnd"/>
+      <w:r>
+        <w:t>(is.na(</w:t>
+      </w:r>
+      <w:proofErr w:type="spellStart"/>
+      <w:r>
+        <w:t>gss_data</w:t>
+      </w:r>
+      <w:proofErr w:type="spellEnd"/>
+      <w:r>
+        <w:t xml:space="preserve">)) &lt; </w:t>
+      </w:r>
+      <w:proofErr w:type="spellStart"/>
+      <w:r>
+        <w:t>nrow</w:t>
+      </w:r>
+      <w:proofErr w:type="spellEnd"/>
+      <w:r>
+        <w:t>(</w:t>
+      </w:r>
+      <w:proofErr w:type="spellStart"/>
+      <w:r>
+        <w:t>gss_data</w:t>
+      </w:r>
+      <w:proofErr w:type="spellEnd"/>
+      <w:r>
+        <w:t>)]</w:t>
+      </w:r>
+    </w:p>
+    <w:p>
+      <w:pPr>
+        <w:spacing w:after="0"/>
+      </w:pPr>
+    </w:p>
+    <w:p>
+      <w:pPr>
+        <w:spacing w:after="0"/>
+      </w:pPr>
+      <w:r>
+        <w:t xml:space="preserve">gss_data1$sex &lt;- </w:t>
+      </w:r>
+      <w:proofErr w:type="spellStart"/>
+      <w:r>
+        <w:t>as_factor</w:t>
+      </w:r>
+      <w:proofErr w:type="spellEnd"/>
+      <w:r>
+        <w:t>(gss_data1$sex)</w:t>
       </w:r>
     </w:p>
     <w:p>
@@ -9182,7 +9449,39 @@
         <w:spacing w:after="0"/>
       </w:pPr>
       <w:r>
-        <w:t>gss_data2 &lt;- gss_data1[, c("happy", "goodlife", "satfin", "degree", "realinc", "age", "sex", "polviews")]</w:t>
+        <w:t>gss_data2 &lt;- gss_data1[, c("happy", "</w:t>
+      </w:r>
+      <w:proofErr w:type="spellStart"/>
+      <w:r>
+        <w:t>goodlife</w:t>
+      </w:r>
+      <w:proofErr w:type="spellEnd"/>
+      <w:r>
+        <w:t>", "</w:t>
+      </w:r>
+      <w:proofErr w:type="spellStart"/>
+      <w:r>
+        <w:t>satfin</w:t>
+      </w:r>
+      <w:proofErr w:type="spellEnd"/>
+      <w:r>
+        <w:t>", "degree", "</w:t>
+      </w:r>
+      <w:proofErr w:type="spellStart"/>
+      <w:r>
+        <w:t>realinc</w:t>
+      </w:r>
+      <w:proofErr w:type="spellEnd"/>
+      <w:r>
+        <w:t>", "age", "sex", "</w:t>
+      </w:r>
+      <w:proofErr w:type="spellStart"/>
+      <w:r>
+        <w:t>polviews</w:t>
+      </w:r>
+      <w:proofErr w:type="spellEnd"/>
+      <w:r>
+        <w:t>")]</w:t>
       </w:r>
     </w:p>
     <w:p>
@@ -9227,7 +9526,15 @@
         <w:spacing w:after="0"/>
       </w:pPr>
       <w:r>
-        <w:t>library(tidyverse)</w:t>
+        <w:t>library(</w:t>
+      </w:r>
+      <w:proofErr w:type="spellStart"/>
+      <w:r>
+        <w:t>tidyverse</w:t>
+      </w:r>
+      <w:proofErr w:type="spellEnd"/>
+      <w:r>
+        <w:t>)</w:t>
       </w:r>
     </w:p>
     <w:p>
@@ -9264,15 +9571,28 @@
         <w:spacing w:after="0"/>
       </w:pPr>
       <w:r>
-        <w:t># We must ensure 'sex' is a factor and 'goodlife' is numeric and filtered</w:t>
-      </w:r>
-    </w:p>
-    <w:p>
-      <w:pPr>
-        <w:spacing w:after="0"/>
-      </w:pPr>
-      <w:r>
-        <w:t>gss_clean &lt;- gss_data2 %&gt;%</w:t>
+        <w:t># We must ensure 'sex' is a factor and '</w:t>
+      </w:r>
+      <w:proofErr w:type="spellStart"/>
+      <w:r>
+        <w:t>goodlife</w:t>
+      </w:r>
+      <w:proofErr w:type="spellEnd"/>
+      <w:r>
+        <w:t>' is numeric and filtered</w:t>
+      </w:r>
+    </w:p>
+    <w:p>
+      <w:pPr>
+        <w:spacing w:after="0"/>
+      </w:pPr>
+      <w:proofErr w:type="spellStart"/>
+      <w:r>
+        <w:t>gss_clean</w:t>
+      </w:r>
+      <w:proofErr w:type="spellEnd"/>
+      <w:r>
+        <w:t xml:space="preserve"> &lt;- gss_data2 %&gt;%</w:t>
       </w:r>
     </w:p>
     <w:p>
@@ -9288,23 +9608,15 @@
         <w:spacing w:after="0"/>
       </w:pPr>
       <w:r>
-        <w:t xml:space="preserve">    # Convert goodlife to numeric and handle GSS missing codes (0, 8, 9) [cite: 68-72]</w:t>
-      </w:r>
-    </w:p>
-    <w:p>
-      <w:pPr>
-        <w:spacing w:after="0"/>
-      </w:pPr>
-      <w:r>
-        <w:t xml:space="preserve">    goodlife_num = as.numeric(as.character(goodlife)),</w:t>
-      </w:r>
-    </w:p>
-    <w:p>
-      <w:pPr>
-        <w:spacing w:after="0"/>
-      </w:pPr>
-      <w:r>
-        <w:t xml:space="preserve">    goodlife_num = ifelse(goodlife_num &gt; 5, NA, goodlife_num),</w:t>
+        <w:t xml:space="preserve">    # Convert </w:t>
+      </w:r>
+      <w:proofErr w:type="spellStart"/>
+      <w:r>
+        <w:t>goodlife</w:t>
+      </w:r>
+      <w:proofErr w:type="spellEnd"/>
+      <w:r>
+        <w:t xml:space="preserve"> to numeric and handle GSS missing codes (0, 8, 9) [cite: 68-72]</w:t>
       </w:r>
     </w:p>
     <w:p>
@@ -9314,6 +9626,86 @@
       <w:r>
         <w:t xml:space="preserve">    </w:t>
       </w:r>
+      <w:proofErr w:type="spellStart"/>
+      <w:r>
+        <w:t>goodlife_num</w:t>
+      </w:r>
+      <w:proofErr w:type="spellEnd"/>
+      <w:r>
+        <w:t xml:space="preserve"> = </w:t>
+      </w:r>
+      <w:proofErr w:type="spellStart"/>
+      <w:r>
+        <w:t>as.numeric</w:t>
+      </w:r>
+      <w:proofErr w:type="spellEnd"/>
+      <w:r>
+        <w:t>(</w:t>
+      </w:r>
+      <w:proofErr w:type="spellStart"/>
+      <w:r>
+        <w:t>as.character</w:t>
+      </w:r>
+      <w:proofErr w:type="spellEnd"/>
+      <w:r>
+        <w:t>(</w:t>
+      </w:r>
+      <w:proofErr w:type="spellStart"/>
+      <w:r>
+        <w:t>goodlife</w:t>
+      </w:r>
+      <w:proofErr w:type="spellEnd"/>
+      <w:r>
+        <w:t>)),</w:t>
+      </w:r>
+    </w:p>
+    <w:p>
+      <w:pPr>
+        <w:spacing w:after="0"/>
+      </w:pPr>
+      <w:r>
+        <w:t xml:space="preserve">    </w:t>
+      </w:r>
+      <w:proofErr w:type="spellStart"/>
+      <w:r>
+        <w:t>goodlife_num</w:t>
+      </w:r>
+      <w:proofErr w:type="spellEnd"/>
+      <w:r>
+        <w:t xml:space="preserve"> = </w:t>
+      </w:r>
+      <w:proofErr w:type="spellStart"/>
+      <w:r>
+        <w:t>ifelse</w:t>
+      </w:r>
+      <w:proofErr w:type="spellEnd"/>
+      <w:r>
+        <w:t>(</w:t>
+      </w:r>
+      <w:proofErr w:type="spellStart"/>
+      <w:r>
+        <w:t>goodlife_num</w:t>
+      </w:r>
+      <w:proofErr w:type="spellEnd"/>
+      <w:r>
+        <w:t xml:space="preserve"> &gt; 5, NA, </w:t>
+      </w:r>
+      <w:proofErr w:type="spellStart"/>
+      <w:r>
+        <w:t>goodlife_num</w:t>
+      </w:r>
+      <w:proofErr w:type="spellEnd"/>
+      <w:r>
+        <w:t>),</w:t>
+      </w:r>
+    </w:p>
+    <w:p>
+      <w:pPr>
+        <w:spacing w:after="0"/>
+      </w:pPr>
+      <w:r>
+        <w:t xml:space="preserve">    </w:t>
+      </w:r>
     </w:p>
     <w:p>
       <w:pPr>
@@ -9328,7 +9720,23 @@
         <w:spacing w:after="0"/>
       </w:pPr>
       <w:r>
-        <w:t xml:space="preserve">    sex_factor = as.factor(sex)</w:t>
+        <w:t xml:space="preserve">    </w:t>
+      </w:r>
+      <w:proofErr w:type="spellStart"/>
+      <w:r>
+        <w:t>sex_factor</w:t>
+      </w:r>
+      <w:proofErr w:type="spellEnd"/>
+      <w:r>
+        <w:t xml:space="preserve"> = </w:t>
+      </w:r>
+      <w:proofErr w:type="spellStart"/>
+      <w:r>
+        <w:t>as.factor</w:t>
+      </w:r>
+      <w:proofErr w:type="spellEnd"/>
+      <w:r>
+        <w:t>(sex)</w:t>
       </w:r>
     </w:p>
     <w:p>
@@ -9352,23 +9760,71 @@
         <w:spacing w:after="0"/>
       </w:pPr>
       <w:r>
-        <w:t xml:space="preserve">  filter(sex_factor %in% c("male", "female"), !is.na(goodlife_num)) %&gt;%</w:t>
-      </w:r>
-    </w:p>
-    <w:p>
-      <w:pPr>
-        <w:spacing w:after="0"/>
-      </w:pPr>
-      <w:r>
-        <w:t xml:space="preserve">  # Drop unused levels like 'skipped on web' or 'iap'</w:t>
-      </w:r>
-    </w:p>
-    <w:p>
-      <w:pPr>
-        <w:spacing w:after="0"/>
-      </w:pPr>
-      <w:r>
-        <w:t xml:space="preserve">  mutate(sex_factor = fct_drop(sex_factor))</w:t>
+        <w:t xml:space="preserve">  filter(</w:t>
+      </w:r>
+      <w:proofErr w:type="spellStart"/>
+      <w:r>
+        <w:t>sex_factor</w:t>
+      </w:r>
+      <w:proofErr w:type="spellEnd"/>
+      <w:r>
+        <w:t xml:space="preserve"> %in% c("male", "female"), !is.na(</w:t>
+      </w:r>
+      <w:proofErr w:type="spellStart"/>
+      <w:r>
+        <w:t>goodlife_num</w:t>
+      </w:r>
+      <w:proofErr w:type="spellEnd"/>
+      <w:r>
+        <w:t>)) %&gt;%</w:t>
+      </w:r>
+    </w:p>
+    <w:p>
+      <w:pPr>
+        <w:spacing w:after="0"/>
+      </w:pPr>
+      <w:r>
+        <w:t xml:space="preserve">  # Drop unused levels like 'skipped on web' or '</w:t>
+      </w:r>
+      <w:proofErr w:type="spellStart"/>
+      <w:r>
+        <w:t>iap</w:t>
+      </w:r>
+      <w:proofErr w:type="spellEnd"/>
+      <w:r>
+        <w:t>'</w:t>
+      </w:r>
+    </w:p>
+    <w:p>
+      <w:pPr>
+        <w:spacing w:after="0"/>
+      </w:pPr>
+      <w:r>
+        <w:t xml:space="preserve">  mutate(</w:t>
+      </w:r>
+      <w:proofErr w:type="spellStart"/>
+      <w:r>
+        <w:t>sex_factor</w:t>
+      </w:r>
+      <w:proofErr w:type="spellEnd"/>
+      <w:r>
+        <w:t xml:space="preserve"> = </w:t>
+      </w:r>
+      <w:proofErr w:type="spellStart"/>
+      <w:r>
+        <w:t>fct_drop</w:t>
+      </w:r>
+      <w:proofErr w:type="spellEnd"/>
+      <w:r>
+        <w:t>(</w:t>
+      </w:r>
+      <w:proofErr w:type="spellStart"/>
+      <w:r>
+        <w:t>sex_factor</w:t>
+      </w:r>
+      <w:proofErr w:type="spellEnd"/>
+      <w:r>
+        <w:t>))</w:t>
       </w:r>
     </w:p>
     <w:p>
@@ -9396,40 +9852,93 @@
       <w:pPr>
         <w:spacing w:after="0"/>
       </w:pPr>
-      <w:r>
-        <w:t>gss_clean %&gt;%</w:t>
-      </w:r>
-    </w:p>
-    <w:p>
-      <w:pPr>
-        <w:spacing w:after="0"/>
-      </w:pPr>
-      <w:r>
-        <w:t xml:space="preserve">  group_by(sex_factor) %&gt;%</w:t>
-      </w:r>
-    </w:p>
-    <w:p>
-      <w:pPr>
-        <w:spacing w:after="0"/>
-      </w:pPr>
-      <w:r>
-        <w:t xml:space="preserve">  summarise(</w:t>
-      </w:r>
-    </w:p>
-    <w:p>
-      <w:pPr>
-        <w:spacing w:after="0"/>
-      </w:pPr>
-      <w:r>
-        <w:t xml:space="preserve">    Mean = mean(goodlife_num),</w:t>
-      </w:r>
-    </w:p>
-    <w:p>
-      <w:pPr>
-        <w:spacing w:after="0"/>
-      </w:pPr>
-      <w:r>
-        <w:t xml:space="preserve">    SD = sd(goodlife_num),</w:t>
+      <w:proofErr w:type="spellStart"/>
+      <w:r>
+        <w:t>gss_clean</w:t>
+      </w:r>
+      <w:proofErr w:type="spellEnd"/>
+      <w:r>
+        <w:t xml:space="preserve"> %&gt;%</w:t>
+      </w:r>
+    </w:p>
+    <w:p>
+      <w:pPr>
+        <w:spacing w:after="0"/>
+      </w:pPr>
+      <w:r>
+        <w:t xml:space="preserve">  </w:t>
+      </w:r>
+      <w:proofErr w:type="spellStart"/>
+      <w:r>
+        <w:t>group_by</w:t>
+      </w:r>
+      <w:proofErr w:type="spellEnd"/>
+      <w:r>
+        <w:t>(</w:t>
+      </w:r>
+      <w:proofErr w:type="spellStart"/>
+      <w:r>
+        <w:t>sex_factor</w:t>
+      </w:r>
+      <w:proofErr w:type="spellEnd"/>
+      <w:r>
+        <w:t>) %&gt;%</w:t>
+      </w:r>
+    </w:p>
+    <w:p>
+      <w:pPr>
+        <w:spacing w:after="0"/>
+      </w:pPr>
+      <w:r>
+        <w:t xml:space="preserve">  </w:t>
+      </w:r>
+      <w:proofErr w:type="spellStart"/>
+      <w:r>
+        <w:t>summarise</w:t>
+      </w:r>
+      <w:proofErr w:type="spellEnd"/>
+      <w:r>
+        <w:t>(</w:t>
+      </w:r>
+    </w:p>
+    <w:p>
+      <w:pPr>
+        <w:spacing w:after="0"/>
+      </w:pPr>
+      <w:r>
+        <w:t xml:space="preserve">    Mean = mean(</w:t>
+      </w:r>
+      <w:proofErr w:type="spellStart"/>
+      <w:r>
+        <w:t>goodlife_num</w:t>
+      </w:r>
+      <w:proofErr w:type="spellEnd"/>
+      <w:r>
+        <w:t>),</w:t>
+      </w:r>
+    </w:p>
+    <w:p>
+      <w:pPr>
+        <w:spacing w:after="0"/>
+      </w:pPr>
+      <w:r>
+        <w:t xml:space="preserve">    SD = </w:t>
+      </w:r>
+      <w:proofErr w:type="spellStart"/>
+      <w:r>
+        <w:t>sd</w:t>
+      </w:r>
+      <w:proofErr w:type="spellEnd"/>
+      <w:r>
+        <w:t>(</w:t>
+      </w:r>
+      <w:proofErr w:type="spellStart"/>
+      <w:r>
+        <w:t>goodlife_num</w:t>
+      </w:r>
+      <w:proofErr w:type="spellEnd"/>
+      <w:r>
+        <w:t>),</w:t>
       </w:r>
     </w:p>
     <w:p>
@@ -9466,23 +9975,76 @@
         <w:spacing w:after="0"/>
       </w:pPr>
       <w:r>
-        <w:t xml:space="preserve"># This will now run because sex_factor is an explicit factor </w:t>
-      </w:r>
-    </w:p>
-    <w:p>
-      <w:pPr>
-        <w:spacing w:after="0"/>
-      </w:pPr>
-      <w:r>
-        <w:t>lt &lt;- leveneTest(goodlife_num ~ sex_factor, data = gss_clean)</w:t>
-      </w:r>
-    </w:p>
-    <w:p>
-      <w:pPr>
-        <w:spacing w:after="0"/>
-      </w:pPr>
-      <w:r>
-        <w:t>print(lt)</w:t>
+        <w:t xml:space="preserve"># This will now run because </w:t>
+      </w:r>
+      <w:proofErr w:type="spellStart"/>
+      <w:r>
+        <w:t>sex_factor</w:t>
+      </w:r>
+      <w:proofErr w:type="spellEnd"/>
+      <w:r>
+        <w:t xml:space="preserve"> is an explicit factor </w:t>
+      </w:r>
+    </w:p>
+    <w:p>
+      <w:pPr>
+        <w:spacing w:after="0"/>
+      </w:pPr>
+      <w:proofErr w:type="spellStart"/>
+      <w:r>
+        <w:t>lt</w:t>
+      </w:r>
+      <w:proofErr w:type="spellEnd"/>
+      <w:r>
+        <w:t xml:space="preserve"> &lt;- </w:t>
+      </w:r>
+      <w:proofErr w:type="spellStart"/>
+      <w:r>
+        <w:t>leveneTest</w:t>
+      </w:r>
+      <w:proofErr w:type="spellEnd"/>
+      <w:r>
+        <w:t>(</w:t>
+      </w:r>
+      <w:proofErr w:type="spellStart"/>
+      <w:r>
+        <w:t>goodlife_num</w:t>
+      </w:r>
+      <w:proofErr w:type="spellEnd"/>
+      <w:r>
+        <w:t xml:space="preserve"> ~ </w:t>
+      </w:r>
+      <w:proofErr w:type="spellStart"/>
+      <w:r>
+        <w:t>sex_factor</w:t>
+      </w:r>
+      <w:proofErr w:type="spellEnd"/>
+      <w:r>
+        <w:t xml:space="preserve">, data = </w:t>
+      </w:r>
+      <w:proofErr w:type="spellStart"/>
+      <w:r>
+        <w:t>gss_clean</w:t>
+      </w:r>
+      <w:proofErr w:type="spellEnd"/>
+      <w:r>
+        <w:t>)</w:t>
+      </w:r>
+    </w:p>
+    <w:p>
+      <w:pPr>
+        <w:spacing w:after="0"/>
+      </w:pPr>
+      <w:r>
+        <w:t>print(</w:t>
+      </w:r>
+      <w:proofErr w:type="spellStart"/>
+      <w:r>
+        <w:t>lt</w:t>
+      </w:r>
+      <w:proofErr w:type="spellEnd"/>
+      <w:r>
+        <w:t>)</w:t>
       </w:r>
     </w:p>
     <w:p>
@@ -9510,21 +10072,74 @@
       <w:pPr>
         <w:spacing w:after="0"/>
       </w:pPr>
-      <w:r>
-        <w:t>t_test_results &lt;- t.test(goodlife_num ~ sex_factor, data = gss_clean, var.equal = TRUE)</w:t>
-      </w:r>
-    </w:p>
-    <w:p>
-      <w:pPr>
-        <w:spacing w:after="0"/>
-      </w:pPr>
-    </w:p>
-    <w:p>
-      <w:pPr>
-        <w:spacing w:after="0"/>
-      </w:pPr>
-      <w:r>
-        <w:t>print(t_test_results)</w:t>
+      <w:proofErr w:type="spellStart"/>
+      <w:r>
+        <w:t>t_test_results</w:t>
+      </w:r>
+      <w:proofErr w:type="spellEnd"/>
+      <w:r>
+        <w:t xml:space="preserve"> &lt;- </w:t>
+      </w:r>
+      <w:proofErr w:type="spellStart"/>
+      <w:r>
+        <w:t>t.test</w:t>
+      </w:r>
+      <w:proofErr w:type="spellEnd"/>
+      <w:r>
+        <w:t>(</w:t>
+      </w:r>
+      <w:proofErr w:type="spellStart"/>
+      <w:r>
+        <w:t>goodlife_num</w:t>
+      </w:r>
+      <w:proofErr w:type="spellEnd"/>
+      <w:r>
+        <w:t xml:space="preserve"> ~ </w:t>
+      </w:r>
+      <w:proofErr w:type="spellStart"/>
+      <w:r>
+        <w:t>sex_factor</w:t>
+      </w:r>
+      <w:proofErr w:type="spellEnd"/>
+      <w:r>
+        <w:t xml:space="preserve">, data = </w:t>
+      </w:r>
+      <w:proofErr w:type="spellStart"/>
+      <w:r>
+        <w:t>gss_clean</w:t>
+      </w:r>
+      <w:proofErr w:type="spellEnd"/>
+      <w:r>
+        <w:t xml:space="preserve">, </w:t>
+      </w:r>
+      <w:proofErr w:type="spellStart"/>
+      <w:r>
+        <w:t>var.equal</w:t>
+      </w:r>
+      <w:proofErr w:type="spellEnd"/>
+      <w:r>
+        <w:t xml:space="preserve"> = TRUE)</w:t>
+      </w:r>
+    </w:p>
+    <w:p>
+      <w:pPr>
+        <w:spacing w:after="0"/>
+      </w:pPr>
+    </w:p>
+    <w:p>
+      <w:pPr>
+        <w:spacing w:after="0"/>
+      </w:pPr>
+      <w:r>
+        <w:t>print(</w:t>
+      </w:r>
+      <w:proofErr w:type="spellStart"/>
+      <w:r>
+        <w:t>t_test_results</w:t>
+      </w:r>
+      <w:proofErr w:type="spellEnd"/>
+      <w:r>
+        <w:t>)</w:t>
       </w:r>
     </w:p>
     <w:p>
@@ -9545,39 +10160,95 @@
         <w:spacing w:after="0"/>
       </w:pPr>
       <w:r>
-        <w:t>batch1_plot_data &lt;- gss_clean %&gt;%</w:t>
-      </w:r>
-    </w:p>
-    <w:p>
-      <w:pPr>
-        <w:spacing w:after="0"/>
-      </w:pPr>
-      <w:r>
-        <w:t xml:space="preserve">  group_by(sex_factor) %&gt;%</w:t>
-      </w:r>
-    </w:p>
-    <w:p>
-      <w:pPr>
-        <w:spacing w:after="0"/>
-      </w:pPr>
-      <w:r>
-        <w:t xml:space="preserve">  summarise(</w:t>
-      </w:r>
-    </w:p>
-    <w:p>
-      <w:pPr>
-        <w:spacing w:after="0"/>
-      </w:pPr>
-      <w:r>
-        <w:t xml:space="preserve">    Mean = mean(goodlife_num, na.rm = TRUE),</w:t>
-      </w:r>
-    </w:p>
-    <w:p>
-      <w:pPr>
-        <w:spacing w:after="0"/>
-      </w:pPr>
-      <w:r>
-        <w:t xml:space="preserve">    SD = sd(goodlife_num, na.rm = TRUE),</w:t>
+        <w:t xml:space="preserve">batch1_plot_data &lt;- </w:t>
+      </w:r>
+      <w:proofErr w:type="spellStart"/>
+      <w:r>
+        <w:t>gss_clean</w:t>
+      </w:r>
+      <w:proofErr w:type="spellEnd"/>
+      <w:r>
+        <w:t xml:space="preserve"> %&gt;%</w:t>
+      </w:r>
+    </w:p>
+    <w:p>
+      <w:pPr>
+        <w:spacing w:after="0"/>
+      </w:pPr>
+      <w:r>
+        <w:t xml:space="preserve">  </w:t>
+      </w:r>
+      <w:proofErr w:type="spellStart"/>
+      <w:r>
+        <w:t>group_by</w:t>
+      </w:r>
+      <w:proofErr w:type="spellEnd"/>
+      <w:r>
+        <w:t>(</w:t>
+      </w:r>
+      <w:proofErr w:type="spellStart"/>
+      <w:r>
+        <w:t>sex_factor</w:t>
+      </w:r>
+      <w:proofErr w:type="spellEnd"/>
+      <w:r>
+        <w:t>) %&gt;%</w:t>
+      </w:r>
+    </w:p>
+    <w:p>
+      <w:pPr>
+        <w:spacing w:after="0"/>
+      </w:pPr>
+      <w:r>
+        <w:t xml:space="preserve">  </w:t>
+      </w:r>
+      <w:proofErr w:type="spellStart"/>
+      <w:r>
+        <w:t>summarise</w:t>
+      </w:r>
+      <w:proofErr w:type="spellEnd"/>
+      <w:r>
+        <w:t>(</w:t>
+      </w:r>
+    </w:p>
+    <w:p>
+      <w:pPr>
+        <w:spacing w:after="0"/>
+      </w:pPr>
+      <w:r>
+        <w:t xml:space="preserve">    Mean = mean(</w:t>
+      </w:r>
+      <w:proofErr w:type="spellStart"/>
+      <w:r>
+        <w:t>goodlife_num</w:t>
+      </w:r>
+      <w:proofErr w:type="spellEnd"/>
+      <w:r>
+        <w:t>, na.rm = TRUE),</w:t>
+      </w:r>
+    </w:p>
+    <w:p>
+      <w:pPr>
+        <w:spacing w:after="0"/>
+      </w:pPr>
+      <w:r>
+        <w:t xml:space="preserve">    SD = </w:t>
+      </w:r>
+      <w:proofErr w:type="spellStart"/>
+      <w:r>
+        <w:t>sd</w:t>
+      </w:r>
+      <w:proofErr w:type="spellEnd"/>
+      <w:r>
+        <w:t>(</w:t>
+      </w:r>
+      <w:proofErr w:type="spellStart"/>
+      <w:r>
+        <w:t>goodlife_num</w:t>
+      </w:r>
+      <w:proofErr w:type="spellEnd"/>
+      <w:r>
+        <w:t>, na.rm = TRUE),</w:t>
       </w:r>
     </w:p>
     <w:p>
@@ -9621,24 +10292,93 @@
       <w:pPr>
         <w:spacing w:after="0"/>
       </w:pPr>
-      <w:r>
-        <w:t>ggplot(batch1_plot_data, aes(x = sex_factor, y = Mean, fill = sex_factor)) +</w:t>
-      </w:r>
-    </w:p>
-    <w:p>
-      <w:pPr>
-        <w:spacing w:after="0"/>
-      </w:pPr>
-      <w:r>
-        <w:t xml:space="preserve">  geom_bar(stat = "identity", width = 0.6, color = "black", alpha = 0.8) +</w:t>
-      </w:r>
-    </w:p>
-    <w:p>
-      <w:pPr>
-        <w:spacing w:after="0"/>
-      </w:pPr>
-      <w:r>
-        <w:t xml:space="preserve">  geom_errorbar(aes(ymin = Mean - SE, ymax = Mean + SE), width = 0.2) +</w:t>
+      <w:proofErr w:type="spellStart"/>
+      <w:r>
+        <w:t>ggplot</w:t>
+      </w:r>
+      <w:proofErr w:type="spellEnd"/>
+      <w:r>
+        <w:t xml:space="preserve">(batch1_plot_data, </w:t>
+      </w:r>
+      <w:proofErr w:type="spellStart"/>
+      <w:r>
+        <w:t>aes</w:t>
+      </w:r>
+      <w:proofErr w:type="spellEnd"/>
+      <w:r>
+        <w:t xml:space="preserve">(x = </w:t>
+      </w:r>
+      <w:proofErr w:type="spellStart"/>
+      <w:r>
+        <w:t>sex_factor</w:t>
+      </w:r>
+      <w:proofErr w:type="spellEnd"/>
+      <w:r>
+        <w:t xml:space="preserve">, y = Mean, fill = </w:t>
+      </w:r>
+      <w:proofErr w:type="spellStart"/>
+      <w:r>
+        <w:t>sex_factor</w:t>
+      </w:r>
+      <w:proofErr w:type="spellEnd"/>
+      <w:r>
+        <w:t>)) +</w:t>
+      </w:r>
+    </w:p>
+    <w:p>
+      <w:pPr>
+        <w:spacing w:after="0"/>
+      </w:pPr>
+      <w:r>
+        <w:t xml:space="preserve">  </w:t>
+      </w:r>
+      <w:proofErr w:type="spellStart"/>
+      <w:r>
+        <w:t>geom_bar</w:t>
+      </w:r>
+      <w:proofErr w:type="spellEnd"/>
+      <w:r>
+        <w:t>(stat = "identity", width = 0.6, color = "black", alpha = 0.8) +</w:t>
+      </w:r>
+    </w:p>
+    <w:p>
+      <w:pPr>
+        <w:spacing w:after="0"/>
+      </w:pPr>
+      <w:r>
+        <w:t xml:space="preserve">  </w:t>
+      </w:r>
+      <w:proofErr w:type="spellStart"/>
+      <w:r>
+        <w:t>geom_errorbar</w:t>
+      </w:r>
+      <w:proofErr w:type="spellEnd"/>
+      <w:r>
+        <w:t>(</w:t>
+      </w:r>
+      <w:proofErr w:type="spellStart"/>
+      <w:r>
+        <w:t>aes</w:t>
+      </w:r>
+      <w:proofErr w:type="spellEnd"/>
+      <w:r>
+        <w:t>(</w:t>
+      </w:r>
+      <w:proofErr w:type="spellStart"/>
+      <w:r>
+        <w:t>ymin</w:t>
+      </w:r>
+      <w:proofErr w:type="spellEnd"/>
+      <w:r>
+        <w:t xml:space="preserve"> = Mean - SE, </w:t>
+      </w:r>
+      <w:proofErr w:type="spellStart"/>
+      <w:r>
+        <w:t>ymax</w:t>
+      </w:r>
+      <w:proofErr w:type="spellEnd"/>
+      <w:r>
+        <w:t xml:space="preserve"> = Mean + SE), width = 0.2) +</w:t>
       </w:r>
     </w:p>
     <w:p>
@@ -9702,23 +10442,47 @@
         <w:spacing w:after="0"/>
       </w:pPr>
       <w:r>
-        <w:t xml:space="preserve">  theme_minimal() +</w:t>
-      </w:r>
-    </w:p>
-    <w:p>
-      <w:pPr>
-        <w:spacing w:after="0"/>
-      </w:pPr>
-      <w:r>
-        <w:t xml:space="preserve">  scale_fill_manual(values = c("female" = "#f8766d", "male" = "#00bfc4")) +</w:t>
-      </w:r>
-    </w:p>
-    <w:p>
-      <w:pPr>
-        <w:spacing w:after="0"/>
-      </w:pPr>
-      <w:r>
-        <w:t xml:space="preserve">  theme(legend.position = "none") # Hide legend as X-axis labels are clear</w:t>
+        <w:t xml:space="preserve">  </w:t>
+      </w:r>
+      <w:proofErr w:type="spellStart"/>
+      <w:r>
+        <w:t>theme_minimal</w:t>
+      </w:r>
+      <w:proofErr w:type="spellEnd"/>
+      <w:r>
+        <w:t>() +</w:t>
+      </w:r>
+    </w:p>
+    <w:p>
+      <w:pPr>
+        <w:spacing w:after="0"/>
+      </w:pPr>
+      <w:r>
+        <w:t xml:space="preserve">  </w:t>
+      </w:r>
+      <w:proofErr w:type="spellStart"/>
+      <w:r>
+        <w:t>scale_fill_manual</w:t>
+      </w:r>
+      <w:proofErr w:type="spellEnd"/>
+      <w:r>
+        <w:t>(values = c("female" = "#f8766d", "male" = "#00bfc4")) +</w:t>
+      </w:r>
+    </w:p>
+    <w:p>
+      <w:pPr>
+        <w:spacing w:after="0"/>
+      </w:pPr>
+      <w:r>
+        <w:t xml:space="preserve">  theme(</w:t>
+      </w:r>
+      <w:proofErr w:type="spellStart"/>
+      <w:r>
+        <w:t>legend.position</w:t>
+      </w:r>
+      <w:proofErr w:type="spellEnd"/>
+      <w:r>
+        <w:t xml:space="preserve"> = "none") # Hide legend as X-axis labels are clear</w:t>
       </w:r>
     </w:p>
     <w:p>
@@ -9771,8 +10535,21 @@
         <w:spacing w:after="0"/>
       </w:pPr>
       <w:r>
-        <w:t># IV1: sex_factor, IV2: degree, DV: goodlife_num</w:t>
-      </w:r>
+        <w:t xml:space="preserve"># IV1: </w:t>
+      </w:r>
+      <w:proofErr w:type="spellStart"/>
+      <w:r>
+        <w:t>sex_factor</w:t>
+      </w:r>
+      <w:proofErr w:type="spellEnd"/>
+      <w:r>
+        <w:t xml:space="preserve">, IV2: degree, DV: </w:t>
+      </w:r>
+      <w:proofErr w:type="spellStart"/>
+      <w:r>
+        <w:t>goodlife_num</w:t>
+      </w:r>
+      <w:proofErr w:type="spellEnd"/>
     </w:p>
     <w:p>
       <w:pPr>
@@ -9792,7 +10569,15 @@
         <w:spacing w:after="0"/>
       </w:pPr>
       <w:r>
-        <w:t>gss_batch2 &lt;- gss_clean %&gt;%</w:t>
+        <w:t xml:space="preserve">gss_batch2 &lt;- </w:t>
+      </w:r>
+      <w:proofErr w:type="spellStart"/>
+      <w:r>
+        <w:t>gss_clean</w:t>
+      </w:r>
+      <w:proofErr w:type="spellEnd"/>
+      <w:r>
+        <w:t xml:space="preserve"> %&gt;%</w:t>
       </w:r>
     </w:p>
     <w:p>
@@ -9816,15 +10601,55 @@
         <w:spacing w:after="0"/>
       </w:pPr>
       <w:r>
-        <w:t xml:space="preserve">    degree_factor = as.factor(degree),</w:t>
-      </w:r>
-    </w:p>
-    <w:p>
-      <w:pPr>
-        <w:spacing w:after="0"/>
-      </w:pPr>
-      <w:r>
-        <w:t xml:space="preserve">    degree_factor = fct_recode(degree_factor,</w:t>
+        <w:t xml:space="preserve">    </w:t>
+      </w:r>
+      <w:proofErr w:type="spellStart"/>
+      <w:r>
+        <w:t>degree_factor</w:t>
+      </w:r>
+      <w:proofErr w:type="spellEnd"/>
+      <w:r>
+        <w:t xml:space="preserve"> = </w:t>
+      </w:r>
+      <w:proofErr w:type="spellStart"/>
+      <w:r>
+        <w:t>as.factor</w:t>
+      </w:r>
+      <w:proofErr w:type="spellEnd"/>
+      <w:r>
+        <w:t>(degree),</w:t>
+      </w:r>
+    </w:p>
+    <w:p>
+      <w:pPr>
+        <w:spacing w:after="0"/>
+      </w:pPr>
+      <w:r>
+        <w:t xml:space="preserve">    </w:t>
+      </w:r>
+      <w:proofErr w:type="spellStart"/>
+      <w:r>
+        <w:t>degree_factor</w:t>
+      </w:r>
+      <w:proofErr w:type="spellEnd"/>
+      <w:r>
+        <w:t xml:space="preserve"> = </w:t>
+      </w:r>
+      <w:proofErr w:type="spellStart"/>
+      <w:r>
+        <w:t>fct_recode</w:t>
+      </w:r>
+      <w:proofErr w:type="spellEnd"/>
+      <w:r>
+        <w:t>(</w:t>
+      </w:r>
+      <w:proofErr w:type="spellStart"/>
+      <w:r>
+        <w:t>degree_factor</w:t>
+      </w:r>
+      <w:proofErr w:type="spellEnd"/>
+      <w:r>
+        <w:t>,</w:t>
       </w:r>
     </w:p>
     <w:p>
@@ -9888,7 +10713,15 @@
         <w:spacing w:after="0"/>
       </w:pPr>
       <w:r>
-        <w:t xml:space="preserve">  filter(!is.na(degree_factor))</w:t>
+        <w:t xml:space="preserve">  filter(!is.na(</w:t>
+      </w:r>
+      <w:proofErr w:type="spellStart"/>
+      <w:r>
+        <w:t>degree_factor</w:t>
+      </w:r>
+      <w:proofErr w:type="spellEnd"/>
+      <w:r>
+        <w:t>))</w:t>
       </w:r>
     </w:p>
     <w:p>
@@ -9908,40 +10741,109 @@
       <w:pPr>
         <w:spacing w:after="0"/>
       </w:pPr>
-      <w:r>
-        <w:t>ipv &lt;-gss_batch2 %&gt;%</w:t>
-      </w:r>
-    </w:p>
-    <w:p>
-      <w:pPr>
-        <w:spacing w:after="0"/>
-      </w:pPr>
-      <w:r>
-        <w:t xml:space="preserve">  group_by(degree_factor) %&gt;%</w:t>
-      </w:r>
-    </w:p>
-    <w:p>
-      <w:pPr>
-        <w:spacing w:after="0"/>
-      </w:pPr>
-      <w:r>
-        <w:t xml:space="preserve">  summarise(</w:t>
-      </w:r>
-    </w:p>
-    <w:p>
-      <w:pPr>
-        <w:spacing w:after="0"/>
-      </w:pPr>
-      <w:r>
-        <w:t xml:space="preserve">    Mean_Optimism = mean(goodlife_num, na.rm = TRUE),</w:t>
-      </w:r>
-    </w:p>
-    <w:p>
-      <w:pPr>
-        <w:spacing w:after="0"/>
-      </w:pPr>
-      <w:r>
-        <w:t xml:space="preserve">    Std_Dev = sd(goodlife_num, na.rm = TRUE),</w:t>
+      <w:proofErr w:type="spellStart"/>
+      <w:r>
+        <w:t>ipv</w:t>
+      </w:r>
+      <w:proofErr w:type="spellEnd"/>
+      <w:r>
+        <w:t xml:space="preserve"> &lt;-gss_batch2 %&gt;%</w:t>
+      </w:r>
+    </w:p>
+    <w:p>
+      <w:pPr>
+        <w:spacing w:after="0"/>
+      </w:pPr>
+      <w:r>
+        <w:t xml:space="preserve">  </w:t>
+      </w:r>
+      <w:proofErr w:type="spellStart"/>
+      <w:r>
+        <w:t>group_by</w:t>
+      </w:r>
+      <w:proofErr w:type="spellEnd"/>
+      <w:r>
+        <w:t>(</w:t>
+      </w:r>
+      <w:proofErr w:type="spellStart"/>
+      <w:r>
+        <w:t>degree_factor</w:t>
+      </w:r>
+      <w:proofErr w:type="spellEnd"/>
+      <w:r>
+        <w:t>) %&gt;%</w:t>
+      </w:r>
+    </w:p>
+    <w:p>
+      <w:pPr>
+        <w:spacing w:after="0"/>
+      </w:pPr>
+      <w:r>
+        <w:t xml:space="preserve">  </w:t>
+      </w:r>
+      <w:proofErr w:type="spellStart"/>
+      <w:r>
+        <w:t>summarise</w:t>
+      </w:r>
+      <w:proofErr w:type="spellEnd"/>
+      <w:r>
+        <w:t>(</w:t>
+      </w:r>
+    </w:p>
+    <w:p>
+      <w:pPr>
+        <w:spacing w:after="0"/>
+      </w:pPr>
+      <w:r>
+        <w:t xml:space="preserve">    </w:t>
+      </w:r>
+      <w:proofErr w:type="spellStart"/>
+      <w:r>
+        <w:t>Mean_Optimism</w:t>
+      </w:r>
+      <w:proofErr w:type="spellEnd"/>
+      <w:r>
+        <w:t xml:space="preserve"> = mean(</w:t>
+      </w:r>
+      <w:proofErr w:type="spellStart"/>
+      <w:r>
+        <w:t>goodlife_num</w:t>
+      </w:r>
+      <w:proofErr w:type="spellEnd"/>
+      <w:r>
+        <w:t>, na.rm = TRUE),</w:t>
+      </w:r>
+    </w:p>
+    <w:p>
+      <w:pPr>
+        <w:spacing w:after="0"/>
+      </w:pPr>
+      <w:r>
+        <w:t xml:space="preserve">    </w:t>
+      </w:r>
+      <w:proofErr w:type="spellStart"/>
+      <w:r>
+        <w:t>Std_Dev</w:t>
+      </w:r>
+      <w:proofErr w:type="spellEnd"/>
+      <w:r>
+        <w:t xml:space="preserve"> = </w:t>
+      </w:r>
+      <w:proofErr w:type="spellStart"/>
+      <w:r>
+        <w:t>sd</w:t>
+      </w:r>
+      <w:proofErr w:type="spellEnd"/>
+      <w:r>
+        <w:t>(</w:t>
+      </w:r>
+      <w:proofErr w:type="spellStart"/>
+      <w:r>
+        <w:t>goodlife_num</w:t>
+      </w:r>
+      <w:proofErr w:type="spellEnd"/>
+      <w:r>
+        <w:t>, na.rm = TRUE),</w:t>
       </w:r>
     </w:p>
     <w:p>
@@ -9965,7 +10867,15 @@
         <w:spacing w:after="0"/>
       </w:pPr>
       <w:r>
-        <w:t>print(ipv)</w:t>
+        <w:t>print(</w:t>
+      </w:r>
+      <w:proofErr w:type="spellStart"/>
+      <w:r>
+        <w:t>ipv</w:t>
+      </w:r>
+      <w:proofErr w:type="spellEnd"/>
+      <w:r>
+        <w:t>)</w:t>
       </w:r>
     </w:p>
     <w:p>
@@ -9985,8 +10895,45 @@
       <w:pPr>
         <w:spacing w:after="0"/>
       </w:pPr>
-      <w:r>
-        <w:t>anova_results &lt;- aov(goodlife_num ~ sex_factor * degree_factor, data = gss_batch2)</w:t>
+      <w:proofErr w:type="spellStart"/>
+      <w:r>
+        <w:t>anova_results</w:t>
+      </w:r>
+      <w:proofErr w:type="spellEnd"/>
+      <w:r>
+        <w:t xml:space="preserve"> &lt;- </w:t>
+      </w:r>
+      <w:proofErr w:type="spellStart"/>
+      <w:r>
+        <w:t>aov</w:t>
+      </w:r>
+      <w:proofErr w:type="spellEnd"/>
+      <w:r>
+        <w:t>(</w:t>
+      </w:r>
+      <w:proofErr w:type="spellStart"/>
+      <w:r>
+        <w:t>goodlife_num</w:t>
+      </w:r>
+      <w:proofErr w:type="spellEnd"/>
+      <w:r>
+        <w:t xml:space="preserve"> ~ </w:t>
+      </w:r>
+      <w:proofErr w:type="spellStart"/>
+      <w:r>
+        <w:t>sex_factor</w:t>
+      </w:r>
+      <w:proofErr w:type="spellEnd"/>
+      <w:r>
+        <w:t xml:space="preserve"> * </w:t>
+      </w:r>
+      <w:proofErr w:type="spellStart"/>
+      <w:r>
+        <w:t>degree_factor</w:t>
+      </w:r>
+      <w:proofErr w:type="spellEnd"/>
+      <w:r>
+        <w:t>, data = gss_batch2)</w:t>
       </w:r>
     </w:p>
     <w:p>
@@ -10007,7 +10954,15 @@
         <w:spacing w:after="0"/>
       </w:pPr>
       <w:r>
-        <w:t>summary(anova_results)</w:t>
+        <w:t>summary(</w:t>
+      </w:r>
+      <w:proofErr w:type="spellStart"/>
+      <w:r>
+        <w:t>anova_results</w:t>
+      </w:r>
+      <w:proofErr w:type="spellEnd"/>
+      <w:r>
+        <w:t>)</w:t>
       </w:r>
     </w:p>
     <w:p>
@@ -10027,24 +10982,45 @@
       <w:pPr>
         <w:spacing w:after="0"/>
       </w:pPr>
-      <w:r>
-        <w:t>interaction.plot(gss_batch2$degree_factor, gss_batch2$sex_factor, gss_batch2$goodlife_num,</w:t>
-      </w:r>
-    </w:p>
-    <w:p>
-      <w:pPr>
-        <w:spacing w:after="0"/>
-      </w:pPr>
-      <w:r>
-        <w:t xml:space="preserve">                 xlab = "Highest Degree Attained",</w:t>
-      </w:r>
-    </w:p>
-    <w:p>
-      <w:pPr>
-        <w:spacing w:after="0"/>
-      </w:pPr>
-      <w:r>
-        <w:t xml:space="preserve">                 ylab = "Mean GOODLIFE Score",</w:t>
+      <w:proofErr w:type="spellStart"/>
+      <w:r>
+        <w:t>interaction.plot</w:t>
+      </w:r>
+      <w:proofErr w:type="spellEnd"/>
+      <w:r>
+        <w:t>(gss_batch2$degree_factor, gss_batch2$sex_factor, gss_batch2$goodlife_num,</w:t>
+      </w:r>
+    </w:p>
+    <w:p>
+      <w:pPr>
+        <w:spacing w:after="0"/>
+      </w:pPr>
+      <w:r>
+        <w:t xml:space="preserve">                 </w:t>
+      </w:r>
+      <w:proofErr w:type="spellStart"/>
+      <w:r>
+        <w:t>xlab</w:t>
+      </w:r>
+      <w:proofErr w:type="spellEnd"/>
+      <w:r>
+        <w:t xml:space="preserve"> = "Highest Degree Attained",</w:t>
+      </w:r>
+    </w:p>
+    <w:p>
+      <w:pPr>
+        <w:spacing w:after="0"/>
+      </w:pPr>
+      <w:r>
+        <w:t xml:space="preserve">                 </w:t>
+      </w:r>
+      <w:proofErr w:type="spellStart"/>
+      <w:r>
+        <w:t>ylab</w:t>
+      </w:r>
+      <w:proofErr w:type="spellEnd"/>
+      <w:r>
+        <w:t xml:space="preserve"> = "Mean GOODLIFE Score",</w:t>
       </w:r>
     </w:p>
     <w:p>
@@ -10060,7 +11036,23 @@
         <w:spacing w:after="0"/>
       </w:pPr>
       <w:r>
-        <w:t xml:space="preserve">                 col = c("blue", "red"), lty = 1, lwd = 2)</w:t>
+        <w:t xml:space="preserve">                 col = c("blue", "red"), </w:t>
+      </w:r>
+      <w:proofErr w:type="spellStart"/>
+      <w:r>
+        <w:t>lty</w:t>
+      </w:r>
+      <w:proofErr w:type="spellEnd"/>
+      <w:r>
+        <w:t xml:space="preserve"> = 1, </w:t>
+      </w:r>
+      <w:proofErr w:type="spellStart"/>
+      <w:r>
+        <w:t>lwd</w:t>
+      </w:r>
+      <w:proofErr w:type="spellEnd"/>
+      <w:r>
+        <w:t xml:space="preserve"> = 2)</w:t>
       </w:r>
     </w:p>
     <w:p>
@@ -10125,8 +11117,13 @@
       <w:pPr>
         <w:spacing w:after="0"/>
       </w:pPr>
-      <w:r>
-        <w:t>world_data &lt;- WDI(</w:t>
+      <w:proofErr w:type="spellStart"/>
+      <w:r>
+        <w:t>world_data</w:t>
+      </w:r>
+      <w:proofErr w:type="spellEnd"/>
+      <w:r>
+        <w:t xml:space="preserve"> &lt;- WDI(</w:t>
       </w:r>
     </w:p>
     <w:p>
@@ -10150,31 +11147,63 @@
         <w:spacing w:after="0"/>
       </w:pPr>
       <w:r>
-        <w:t xml:space="preserve">    Life_Expectancy = "SP.DYN.LE00.IN",</w:t>
-      </w:r>
-    </w:p>
-    <w:p>
-      <w:pPr>
-        <w:spacing w:after="0"/>
-      </w:pPr>
-      <w:r>
-        <w:t xml:space="preserve">    GDP_per_capita  = "NY.GDP.PCAP.PP.CD", </w:t>
-      </w:r>
-    </w:p>
-    <w:p>
-      <w:pPr>
-        <w:spacing w:after="0"/>
-      </w:pPr>
-      <w:r>
-        <w:t xml:space="preserve">    Health_Spend    = "SH.XPD.CHEX.GD.ZS",</w:t>
-      </w:r>
-    </w:p>
-    <w:p>
-      <w:pPr>
-        <w:spacing w:after="0"/>
-      </w:pPr>
-      <w:r>
-        <w:t xml:space="preserve">    Education_Rate  = "SE.SEC.ENRR"</w:t>
+        <w:t xml:space="preserve">    </w:t>
+      </w:r>
+      <w:proofErr w:type="spellStart"/>
+      <w:r>
+        <w:t>Life_Expectancy</w:t>
+      </w:r>
+      <w:proofErr w:type="spellEnd"/>
+      <w:r>
+        <w:t xml:space="preserve"> = "SP.DYN.LE00.IN",</w:t>
+      </w:r>
+    </w:p>
+    <w:p>
+      <w:pPr>
+        <w:spacing w:after="0"/>
+      </w:pPr>
+      <w:r>
+        <w:t xml:space="preserve">    </w:t>
+      </w:r>
+      <w:proofErr w:type="spellStart"/>
+      <w:r>
+        <w:t>GDP_per_capita</w:t>
+      </w:r>
+      <w:proofErr w:type="spellEnd"/>
+      <w:r>
+        <w:t xml:space="preserve">  = "NY.GDP.PCAP.PP.CD", </w:t>
+      </w:r>
+    </w:p>
+    <w:p>
+      <w:pPr>
+        <w:spacing w:after="0"/>
+      </w:pPr>
+      <w:r>
+        <w:t xml:space="preserve">    </w:t>
+      </w:r>
+      <w:proofErr w:type="spellStart"/>
+      <w:r>
+        <w:t>Health_Spend</w:t>
+      </w:r>
+      <w:proofErr w:type="spellEnd"/>
+      <w:r>
+        <w:t xml:space="preserve">    = "SH.XPD.CHEX.GD.ZS",</w:t>
+      </w:r>
+    </w:p>
+    <w:p>
+      <w:pPr>
+        <w:spacing w:after="0"/>
+      </w:pPr>
+      <w:r>
+        <w:t xml:space="preserve">    </w:t>
+      </w:r>
+      <w:proofErr w:type="spellStart"/>
+      <w:r>
+        <w:t>Education_Rate</w:t>
+      </w:r>
+      <w:proofErr w:type="spellEnd"/>
+      <w:r>
+        <w:t xml:space="preserve">  = "SE.SEC.ENRR"</w:t>
       </w:r>
     </w:p>
     <w:p>
@@ -10242,8 +11271,29 @@
       <w:pPr>
         <w:spacing w:after="0"/>
       </w:pPr>
-      <w:r>
-        <w:t>country_info &lt;- as.data.frame(WDI_data$country)</w:t>
+      <w:proofErr w:type="spellStart"/>
+      <w:r>
+        <w:t>country_info</w:t>
+      </w:r>
+      <w:proofErr w:type="spellEnd"/>
+      <w:r>
+        <w:t xml:space="preserve"> &lt;- </w:t>
+      </w:r>
+      <w:proofErr w:type="spellStart"/>
+      <w:r>
+        <w:t>as.data.frame</w:t>
+      </w:r>
+      <w:proofErr w:type="spellEnd"/>
+      <w:r>
+        <w:t>(</w:t>
+      </w:r>
+      <w:proofErr w:type="spellStart"/>
+      <w:r>
+        <w:t>WDI_data$country</w:t>
+      </w:r>
+      <w:proofErr w:type="spellEnd"/>
+      <w:r>
+        <w:t>)</w:t>
       </w:r>
     </w:p>
     <w:p>
@@ -10263,29 +11313,76 @@
       <w:pPr>
         <w:spacing w:after="0"/>
       </w:pPr>
-      <w:r>
-        <w:t>region_map &lt;- country_info[, c("iso2c", "region")]</w:t>
-      </w:r>
-    </w:p>
-    <w:p>
-      <w:pPr>
-        <w:spacing w:after="0"/>
-      </w:pPr>
-    </w:p>
-    <w:p>
-      <w:pPr>
-        <w:spacing w:after="0"/>
-      </w:pPr>
-      <w:r>
-        <w:t># Merge it into your world_data</w:t>
-      </w:r>
-    </w:p>
-    <w:p>
-      <w:pPr>
-        <w:spacing w:after="0"/>
-      </w:pPr>
-      <w:r>
-        <w:t>world_data_with_regions &lt;- merge(world_data, region_map, by = "iso2c", all.x = TRUE)</w:t>
+      <w:proofErr w:type="spellStart"/>
+      <w:r>
+        <w:t>region_map</w:t>
+      </w:r>
+      <w:proofErr w:type="spellEnd"/>
+      <w:r>
+        <w:t xml:space="preserve"> &lt;- </w:t>
+      </w:r>
+      <w:proofErr w:type="spellStart"/>
+      <w:r>
+        <w:t>country_info</w:t>
+      </w:r>
+      <w:proofErr w:type="spellEnd"/>
+      <w:r>
+        <w:t>[, c("iso2c", "region")]</w:t>
+      </w:r>
+    </w:p>
+    <w:p>
+      <w:pPr>
+        <w:spacing w:after="0"/>
+      </w:pPr>
+    </w:p>
+    <w:p>
+      <w:pPr>
+        <w:spacing w:after="0"/>
+      </w:pPr>
+      <w:r>
+        <w:t xml:space="preserve"># Merge it into your </w:t>
+      </w:r>
+      <w:proofErr w:type="spellStart"/>
+      <w:r>
+        <w:t>world_data</w:t>
+      </w:r>
+      <w:proofErr w:type="spellEnd"/>
+    </w:p>
+    <w:p>
+      <w:pPr>
+        <w:spacing w:after="0"/>
+      </w:pPr>
+      <w:proofErr w:type="spellStart"/>
+      <w:r>
+        <w:t>world_data_with_regions</w:t>
+      </w:r>
+      <w:proofErr w:type="spellEnd"/>
+      <w:r>
+        <w:t xml:space="preserve"> &lt;- merge(</w:t>
+      </w:r>
+      <w:proofErr w:type="spellStart"/>
+      <w:r>
+        <w:t>world_data</w:t>
+      </w:r>
+      <w:proofErr w:type="spellEnd"/>
+      <w:r>
+        <w:t xml:space="preserve">, </w:t>
+      </w:r>
+      <w:proofErr w:type="spellStart"/>
+      <w:r>
+        <w:t>region_map</w:t>
+      </w:r>
+      <w:proofErr w:type="spellEnd"/>
+      <w:r>
+        <w:t xml:space="preserve">, by = "iso2c", </w:t>
+      </w:r>
+      <w:proofErr w:type="spellStart"/>
+      <w:r>
+        <w:t>all.x</w:t>
+      </w:r>
+      <w:proofErr w:type="spellEnd"/>
+      <w:r>
+        <w:t xml:space="preserve"> = TRUE)</w:t>
       </w:r>
     </w:p>
     <w:p>
@@ -10306,7 +11403,23 @@
         <w:spacing w:after="0"/>
       </w:pPr>
       <w:r>
-        <w:t>world_data1 &lt;- world_data_with_regions[world_data_with_regions$region != "Aggregates", ]</w:t>
+        <w:t xml:space="preserve">world_data1 &lt;- </w:t>
+      </w:r>
+      <w:proofErr w:type="spellStart"/>
+      <w:r>
+        <w:t>world_data_with_regions</w:t>
+      </w:r>
+      <w:proofErr w:type="spellEnd"/>
+      <w:r>
+        <w:t>[</w:t>
+      </w:r>
+      <w:proofErr w:type="spellStart"/>
+      <w:r>
+        <w:t>world_data_with_regions$region</w:t>
+      </w:r>
+      <w:proofErr w:type="spellEnd"/>
+      <w:r>
+        <w:t xml:space="preserve"> != "Aggregates", ]</w:t>
       </w:r>
     </w:p>
     <w:p>
@@ -10347,8 +11460,13 @@
       <w:pPr>
         <w:spacing w:after="0"/>
       </w:pPr>
-      <w:r>
-        <w:t>unwanted_cols &lt;- c("iso2c")</w:t>
+      <w:proofErr w:type="spellStart"/>
+      <w:r>
+        <w:t>unwanted_cols</w:t>
+      </w:r>
+      <w:proofErr w:type="spellEnd"/>
+      <w:r>
+        <w:t xml:space="preserve"> &lt;- c("iso2c")</w:t>
       </w:r>
     </w:p>
     <w:p>
@@ -10377,31 +11495,68 @@
         <w:spacing w:after="0"/>
       </w:pPr>
       <w:r>
-        <w:t xml:space="preserve">  dplyr::select(-one_of(intersect(names(.), unwanted_cols))) %&gt;%</w:t>
-      </w:r>
-    </w:p>
-    <w:p>
-      <w:pPr>
-        <w:spacing w:after="0"/>
-      </w:pPr>
-      <w:r>
         <w:t xml:space="preserve">  </w:t>
       </w:r>
-    </w:p>
-    <w:p>
-      <w:pPr>
-        <w:spacing w:after="0"/>
-      </w:pPr>
-      <w:r>
-        <w:t xml:space="preserve">  # Rename country to country_name</w:t>
-      </w:r>
-    </w:p>
-    <w:p>
-      <w:pPr>
-        <w:spacing w:after="0"/>
-      </w:pPr>
-      <w:r>
-        <w:t xml:space="preserve">  rename(country_name = country)</w:t>
+      <w:proofErr w:type="spellStart"/>
+      <w:r>
+        <w:t>dplyr</w:t>
+      </w:r>
+      <w:proofErr w:type="spellEnd"/>
+      <w:r>
+        <w:t>::select(-</w:t>
+      </w:r>
+      <w:proofErr w:type="spellStart"/>
+      <w:r>
+        <w:t>one_of</w:t>
+      </w:r>
+      <w:proofErr w:type="spellEnd"/>
+      <w:r>
+        <w:t xml:space="preserve">(intersect(names(.), </w:t>
+      </w:r>
+      <w:proofErr w:type="spellStart"/>
+      <w:r>
+        <w:t>unwanted_cols</w:t>
+      </w:r>
+      <w:proofErr w:type="spellEnd"/>
+      <w:r>
+        <w:t>))) %&gt;%</w:t>
+      </w:r>
+    </w:p>
+    <w:p>
+      <w:pPr>
+        <w:spacing w:after="0"/>
+      </w:pPr>
+      <w:r>
+        <w:t xml:space="preserve">  </w:t>
+      </w:r>
+    </w:p>
+    <w:p>
+      <w:pPr>
+        <w:spacing w:after="0"/>
+      </w:pPr>
+      <w:r>
+        <w:t xml:space="preserve">  # Rename country to </w:t>
+      </w:r>
+      <w:proofErr w:type="spellStart"/>
+      <w:r>
+        <w:t>country_name</w:t>
+      </w:r>
+      <w:proofErr w:type="spellEnd"/>
+    </w:p>
+    <w:p>
+      <w:pPr>
+        <w:spacing w:after="0"/>
+      </w:pPr>
+      <w:r>
+        <w:t xml:space="preserve">  rename(</w:t>
+      </w:r>
+      <w:proofErr w:type="spellStart"/>
+      <w:r>
+        <w:t>country_name</w:t>
+      </w:r>
+      <w:proofErr w:type="spellEnd"/>
+      <w:r>
+        <w:t xml:space="preserve"> = country)</w:t>
       </w:r>
     </w:p>
     <w:p>
@@ -10462,23 +11617,57 @@
         <w:spacing w:after="0"/>
       </w:pPr>
       <w:r>
-        <w:t># DV: Life_Expectancy</w:t>
-      </w:r>
-    </w:p>
-    <w:p>
-      <w:pPr>
-        <w:spacing w:after="0"/>
-      </w:pPr>
-      <w:r>
-        <w:t># IVs: GDP_per_capita, Health_Spend, Education_Rate</w:t>
-      </w:r>
-    </w:p>
-    <w:p>
-      <w:pPr>
-        <w:spacing w:after="0"/>
-      </w:pPr>
-      <w:r>
-        <w:t>library(ggfortify)</w:t>
+        <w:t xml:space="preserve"># DV: </w:t>
+      </w:r>
+      <w:proofErr w:type="spellStart"/>
+      <w:r>
+        <w:t>Life_Expectancy</w:t>
+      </w:r>
+      <w:proofErr w:type="spellEnd"/>
+    </w:p>
+    <w:p>
+      <w:pPr>
+        <w:spacing w:after="0"/>
+      </w:pPr>
+      <w:r>
+        <w:t xml:space="preserve"># IVs: </w:t>
+      </w:r>
+      <w:proofErr w:type="spellStart"/>
+      <w:r>
+        <w:t>GDP_per_capita</w:t>
+      </w:r>
+      <w:proofErr w:type="spellEnd"/>
+      <w:r>
+        <w:t xml:space="preserve">, </w:t>
+      </w:r>
+      <w:proofErr w:type="spellStart"/>
+      <w:r>
+        <w:t>Health_Spend</w:t>
+      </w:r>
+      <w:proofErr w:type="spellEnd"/>
+      <w:r>
+        <w:t xml:space="preserve">, </w:t>
+      </w:r>
+      <w:proofErr w:type="spellStart"/>
+      <w:r>
+        <w:t>Education_Rate</w:t>
+      </w:r>
+      <w:proofErr w:type="spellEnd"/>
+    </w:p>
+    <w:p>
+      <w:pPr>
+        <w:spacing w:after="0"/>
+      </w:pPr>
+      <w:r>
+        <w:t>library(</w:t>
+      </w:r>
+      <w:proofErr w:type="spellStart"/>
+      <w:r>
+        <w:t>ggfortify</w:t>
+      </w:r>
+      <w:proofErr w:type="spellEnd"/>
+      <w:r>
+        <w:t>)</w:t>
       </w:r>
     </w:p>
     <w:p>
@@ -10506,8 +11695,53 @@
       <w:pPr>
         <w:spacing w:after="0"/>
       </w:pPr>
-      <w:r>
-        <w:t xml:space="preserve">regression_model &lt;- lm(Life_Expectancy ~ log(GDP_per_capita) + Health_Spend + Education_Rate, </w:t>
+      <w:proofErr w:type="spellStart"/>
+      <w:r>
+        <w:t>regression_model</w:t>
+      </w:r>
+      <w:proofErr w:type="spellEnd"/>
+      <w:r>
+        <w:t xml:space="preserve"> &lt;- </w:t>
+      </w:r>
+      <w:proofErr w:type="spellStart"/>
+      <w:r>
+        <w:t>lm</w:t>
+      </w:r>
+      <w:proofErr w:type="spellEnd"/>
+      <w:r>
+        <w:t>(</w:t>
+      </w:r>
+      <w:proofErr w:type="spellStart"/>
+      <w:r>
+        <w:t>Life_Expectancy</w:t>
+      </w:r>
+      <w:proofErr w:type="spellEnd"/>
+      <w:r>
+        <w:t xml:space="preserve"> ~ log(</w:t>
+      </w:r>
+      <w:proofErr w:type="spellStart"/>
+      <w:r>
+        <w:t>GDP_per_capita</w:t>
+      </w:r>
+      <w:proofErr w:type="spellEnd"/>
+      <w:r>
+        <w:t xml:space="preserve">) + </w:t>
+      </w:r>
+      <w:proofErr w:type="spellStart"/>
+      <w:r>
+        <w:t>Health_Spend</w:t>
+      </w:r>
+      <w:proofErr w:type="spellEnd"/>
+      <w:r>
+        <w:t xml:space="preserve"> + </w:t>
+      </w:r>
+      <w:proofErr w:type="spellStart"/>
+      <w:r>
+        <w:t>Education_Rate</w:t>
+      </w:r>
+      <w:proofErr w:type="spellEnd"/>
+      <w:r>
+        <w:t xml:space="preserve">, </w:t>
       </w:r>
     </w:p>
     <w:p>
@@ -10536,7 +11770,15 @@
         <w:spacing w:after="0"/>
       </w:pPr>
       <w:r>
-        <w:t>summary(regression_model)</w:t>
+        <w:t>summary(</w:t>
+      </w:r>
+      <w:proofErr w:type="spellStart"/>
+      <w:r>
+        <w:t>regression_model</w:t>
+      </w:r>
+      <w:proofErr w:type="spellEnd"/>
+      <w:r>
+        <w:t>)</w:t>
       </w:r>
     </w:p>
     <w:p>
@@ -10551,16 +11793,45 @@
       <w:pPr>
         <w:spacing w:after="0"/>
       </w:pPr>
-      <w:r>
-        <w:t xml:space="preserve">autoplot(regression_model, which = 1:2, ncol = 2) + </w:t>
-      </w:r>
-    </w:p>
-    <w:p>
-      <w:pPr>
-        <w:spacing w:after="0"/>
-      </w:pPr>
-      <w:r>
-        <w:t xml:space="preserve">  theme_minimal() +</w:t>
+      <w:proofErr w:type="spellStart"/>
+      <w:r>
+        <w:t>autoplot</w:t>
+      </w:r>
+      <w:proofErr w:type="spellEnd"/>
+      <w:r>
+        <w:t>(</w:t>
+      </w:r>
+      <w:proofErr w:type="spellStart"/>
+      <w:r>
+        <w:t>regression_model</w:t>
+      </w:r>
+      <w:proofErr w:type="spellEnd"/>
+      <w:r>
+        <w:t xml:space="preserve">, which = 1:2, </w:t>
+      </w:r>
+      <w:proofErr w:type="spellStart"/>
+      <w:r>
+        <w:t>ncol</w:t>
+      </w:r>
+      <w:proofErr w:type="spellEnd"/>
+      <w:r>
+        <w:t xml:space="preserve"> = 2) + </w:t>
+      </w:r>
+    </w:p>
+    <w:p>
+      <w:pPr>
+        <w:spacing w:after="0"/>
+      </w:pPr>
+      <w:r>
+        <w:t xml:space="preserve">  </w:t>
+      </w:r>
+      <w:proofErr w:type="spellStart"/>
+      <w:r>
+        <w:t>theme_minimal</w:t>
+      </w:r>
+      <w:proofErr w:type="spellEnd"/>
+      <w:r>
+        <w:t>() +</w:t>
       </w:r>
     </w:p>
     <w:p>
@@ -10629,7 +11900,15 @@
         <w:spacing w:after="0"/>
       </w:pPr>
       <w:r>
-        <w:t>library(DiagrammeR)</w:t>
+        <w:t>library(</w:t>
+      </w:r>
+      <w:proofErr w:type="spellStart"/>
+      <w:r>
+        <w:t>DiagrammeR</w:t>
+      </w:r>
+      <w:proofErr w:type="spellEnd"/>
+      <w:r>
+        <w:t>)</w:t>
       </w:r>
     </w:p>
     <w:p>
@@ -10649,8 +11928,13 @@
       <w:pPr>
         <w:spacing w:after="0"/>
       </w:pPr>
-      <w:r>
-        <w:t>gss_med &lt;- gss_data2 %&gt;%</w:t>
+      <w:proofErr w:type="spellStart"/>
+      <w:r>
+        <w:t>gss_med</w:t>
+      </w:r>
+      <w:proofErr w:type="spellEnd"/>
+      <w:r>
+        <w:t xml:space="preserve"> &lt;- gss_data2 %&gt;%</w:t>
       </w:r>
     </w:p>
     <w:p>
@@ -10674,7 +11958,23 @@
         <w:spacing w:after="0"/>
       </w:pPr>
       <w:r>
-        <w:t xml:space="preserve">    happy_rev = case_when(</w:t>
+        <w:t xml:space="preserve">    </w:t>
+      </w:r>
+      <w:proofErr w:type="spellStart"/>
+      <w:r>
+        <w:t>happy_rev</w:t>
+      </w:r>
+      <w:proofErr w:type="spellEnd"/>
+      <w:r>
+        <w:t xml:space="preserve"> = </w:t>
+      </w:r>
+      <w:proofErr w:type="spellStart"/>
+      <w:r>
+        <w:t>case_when</w:t>
+      </w:r>
+      <w:proofErr w:type="spellEnd"/>
+      <w:r>
+        <w:t>(</w:t>
       </w:r>
     </w:p>
     <w:p>
@@ -10706,7 +12006,15 @@
         <w:spacing w:after="0"/>
       </w:pPr>
       <w:r>
-        <w:t xml:space="preserve">      TRUE ~ NA_real_</w:t>
+        <w:t xml:space="preserve">      TRUE ~ </w:t>
+      </w:r>
+      <w:proofErr w:type="spellStart"/>
+      <w:r>
+        <w:t>NA_real</w:t>
+      </w:r>
+      <w:proofErr w:type="spellEnd"/>
+      <w:r>
+        <w:t>_</w:t>
       </w:r>
     </w:p>
     <w:p>
@@ -10730,15 +12038,71 @@
         <w:spacing w:after="0"/>
       </w:pPr>
       <w:r>
-        <w:t xml:space="preserve">    income_num = as.numeric(as.character(realinc)),</w:t>
-      </w:r>
-    </w:p>
-    <w:p>
-      <w:pPr>
-        <w:spacing w:after="0"/>
-      </w:pPr>
-      <w:r>
-        <w:t xml:space="preserve">    edu_num = as.numeric(as.character(degree))</w:t>
+        <w:t xml:space="preserve">    </w:t>
+      </w:r>
+      <w:proofErr w:type="spellStart"/>
+      <w:r>
+        <w:t>income_num</w:t>
+      </w:r>
+      <w:proofErr w:type="spellEnd"/>
+      <w:r>
+        <w:t xml:space="preserve"> = </w:t>
+      </w:r>
+      <w:proofErr w:type="spellStart"/>
+      <w:r>
+        <w:t>as.numeric</w:t>
+      </w:r>
+      <w:proofErr w:type="spellEnd"/>
+      <w:r>
+        <w:t>(</w:t>
+      </w:r>
+      <w:proofErr w:type="spellStart"/>
+      <w:r>
+        <w:t>as.character</w:t>
+      </w:r>
+      <w:proofErr w:type="spellEnd"/>
+      <w:r>
+        <w:t>(</w:t>
+      </w:r>
+      <w:proofErr w:type="spellStart"/>
+      <w:r>
+        <w:t>realinc</w:t>
+      </w:r>
+      <w:proofErr w:type="spellEnd"/>
+      <w:r>
+        <w:t>)),</w:t>
+      </w:r>
+    </w:p>
+    <w:p>
+      <w:pPr>
+        <w:spacing w:after="0"/>
+      </w:pPr>
+      <w:r>
+        <w:t xml:space="preserve">    </w:t>
+      </w:r>
+      <w:proofErr w:type="spellStart"/>
+      <w:r>
+        <w:t>edu_num</w:t>
+      </w:r>
+      <w:proofErr w:type="spellEnd"/>
+      <w:r>
+        <w:t xml:space="preserve"> = </w:t>
+      </w:r>
+      <w:proofErr w:type="spellStart"/>
+      <w:r>
+        <w:t>as.numeric</w:t>
+      </w:r>
+      <w:proofErr w:type="spellEnd"/>
+      <w:r>
+        <w:t>(</w:t>
+      </w:r>
+      <w:proofErr w:type="spellStart"/>
+      <w:r>
+        <w:t>as.character</w:t>
+      </w:r>
+      <w:proofErr w:type="spellEnd"/>
+      <w:r>
+        <w:t>(degree))</w:t>
       </w:r>
     </w:p>
     <w:p>
@@ -10754,7 +12118,39 @@
         <w:spacing w:after="0"/>
       </w:pPr>
       <w:r>
-        <w:t xml:space="preserve">  drop_na(happy_rev, income_num, edu_num)</w:t>
+        <w:t xml:space="preserve">  </w:t>
+      </w:r>
+      <w:proofErr w:type="spellStart"/>
+      <w:r>
+        <w:t>drop_na</w:t>
+      </w:r>
+      <w:proofErr w:type="spellEnd"/>
+      <w:r>
+        <w:t>(</w:t>
+      </w:r>
+      <w:proofErr w:type="spellStart"/>
+      <w:r>
+        <w:t>happy_rev</w:t>
+      </w:r>
+      <w:proofErr w:type="spellEnd"/>
+      <w:r>
+        <w:t xml:space="preserve">, </w:t>
+      </w:r>
+      <w:proofErr w:type="spellStart"/>
+      <w:r>
+        <w:t>income_num</w:t>
+      </w:r>
+      <w:proofErr w:type="spellEnd"/>
+      <w:r>
+        <w:t xml:space="preserve">, </w:t>
+      </w:r>
+      <w:proofErr w:type="spellStart"/>
+      <w:r>
+        <w:t>edu_num</w:t>
+      </w:r>
+      <w:proofErr w:type="spellEnd"/>
+      <w:r>
+        <w:t>)</w:t>
       </w:r>
     </w:p>
     <w:p>
@@ -10774,8 +12170,45 @@
       <w:pPr>
         <w:spacing w:after="0"/>
       </w:pPr>
-      <w:r>
-        <w:t>fit.mediator &lt;- lm(income_num ~ edu_num, data = gss_med)</w:t>
+      <w:proofErr w:type="spellStart"/>
+      <w:r>
+        <w:t>fit.mediator</w:t>
+      </w:r>
+      <w:proofErr w:type="spellEnd"/>
+      <w:r>
+        <w:t xml:space="preserve"> &lt;- </w:t>
+      </w:r>
+      <w:proofErr w:type="spellStart"/>
+      <w:r>
+        <w:t>lm</w:t>
+      </w:r>
+      <w:proofErr w:type="spellEnd"/>
+      <w:r>
+        <w:t>(</w:t>
+      </w:r>
+      <w:proofErr w:type="spellStart"/>
+      <w:r>
+        <w:t>income_num</w:t>
+      </w:r>
+      <w:proofErr w:type="spellEnd"/>
+      <w:r>
+        <w:t xml:space="preserve"> ~ </w:t>
+      </w:r>
+      <w:proofErr w:type="spellStart"/>
+      <w:r>
+        <w:t>edu_num</w:t>
+      </w:r>
+      <w:proofErr w:type="spellEnd"/>
+      <w:r>
+        <w:t xml:space="preserve">, data = </w:t>
+      </w:r>
+      <w:proofErr w:type="spellStart"/>
+      <w:r>
+        <w:t>gss_med</w:t>
+      </w:r>
+      <w:proofErr w:type="spellEnd"/>
+      <w:r>
+        <w:t>)</w:t>
       </w:r>
     </w:p>
     <w:p>
@@ -10795,8 +12228,53 @@
       <w:pPr>
         <w:spacing w:after="0"/>
       </w:pPr>
-      <w:r>
-        <w:t>fit.dv &lt;- lm(happy_rev ~ edu_num + income_num, data = gss_med)</w:t>
+      <w:proofErr w:type="spellStart"/>
+      <w:r>
+        <w:t>fit.dv</w:t>
+      </w:r>
+      <w:proofErr w:type="spellEnd"/>
+      <w:r>
+        <w:t xml:space="preserve"> &lt;- </w:t>
+      </w:r>
+      <w:proofErr w:type="spellStart"/>
+      <w:r>
+        <w:t>lm</w:t>
+      </w:r>
+      <w:proofErr w:type="spellEnd"/>
+      <w:r>
+        <w:t>(</w:t>
+      </w:r>
+      <w:proofErr w:type="spellStart"/>
+      <w:r>
+        <w:t>happy_rev</w:t>
+      </w:r>
+      <w:proofErr w:type="spellEnd"/>
+      <w:r>
+        <w:t xml:space="preserve"> ~ </w:t>
+      </w:r>
+      <w:proofErr w:type="spellStart"/>
+      <w:r>
+        <w:t>edu_num</w:t>
+      </w:r>
+      <w:proofErr w:type="spellEnd"/>
+      <w:r>
+        <w:t xml:space="preserve"> + </w:t>
+      </w:r>
+      <w:proofErr w:type="spellStart"/>
+      <w:r>
+        <w:t>income_num</w:t>
+      </w:r>
+      <w:proofErr w:type="spellEnd"/>
+      <w:r>
+        <w:t xml:space="preserve">, data = </w:t>
+      </w:r>
+      <w:proofErr w:type="spellStart"/>
+      <w:r>
+        <w:t>gss_med</w:t>
+      </w:r>
+      <w:proofErr w:type="spellEnd"/>
+      <w:r>
+        <w:t>)</w:t>
       </w:r>
     </w:p>
     <w:p>
@@ -10816,8 +12294,45 @@
       <w:pPr>
         <w:spacing w:after="0"/>
       </w:pPr>
-      <w:r>
-        <w:t>med_results &lt;- mediate(fit.mediator, fit.dv, treat = "edu_num", mediator = "income_num", boot = TRUE, sims = 100)</w:t>
+      <w:proofErr w:type="spellStart"/>
+      <w:r>
+        <w:t>med_results</w:t>
+      </w:r>
+      <w:proofErr w:type="spellEnd"/>
+      <w:r>
+        <w:t xml:space="preserve"> &lt;- mediate(</w:t>
+      </w:r>
+      <w:proofErr w:type="spellStart"/>
+      <w:r>
+        <w:t>fit.mediator</w:t>
+      </w:r>
+      <w:proofErr w:type="spellEnd"/>
+      <w:r>
+        <w:t xml:space="preserve">, </w:t>
+      </w:r>
+      <w:proofErr w:type="spellStart"/>
+      <w:r>
+        <w:t>fit.dv</w:t>
+      </w:r>
+      <w:proofErr w:type="spellEnd"/>
+      <w:r>
+        <w:t>, treat = "</w:t>
+      </w:r>
+      <w:proofErr w:type="spellStart"/>
+      <w:r>
+        <w:t>edu_num</w:t>
+      </w:r>
+      <w:proofErr w:type="spellEnd"/>
+      <w:r>
+        <w:t>", mediator = "</w:t>
+      </w:r>
+      <w:proofErr w:type="spellStart"/>
+      <w:r>
+        <w:t>income_num</w:t>
+      </w:r>
+      <w:proofErr w:type="spellEnd"/>
+      <w:r>
+        <w:t>", boot = TRUE, sims = 100)</w:t>
       </w:r>
     </w:p>
     <w:p>
@@ -10838,7 +12353,15 @@
         <w:spacing w:after="0"/>
       </w:pPr>
       <w:r>
-        <w:t>summary(med_results)</w:t>
+        <w:t>summary(</w:t>
+      </w:r>
+      <w:proofErr w:type="spellStart"/>
+      <w:r>
+        <w:t>med_results</w:t>
+      </w:r>
+      <w:proofErr w:type="spellEnd"/>
+      <w:r>
+        <w:t>)</w:t>
       </w:r>
     </w:p>
     <w:p>
@@ -10858,16 +12381,74 @@
       <w:pPr>
         <w:spacing w:after="0"/>
       </w:pPr>
-      <w:r>
-        <w:t>model_a &lt;- lm(scale(income_num) ~ scale(edu_num), data = gss_med)</w:t>
-      </w:r>
-    </w:p>
-    <w:p>
-      <w:pPr>
-        <w:spacing w:after="0"/>
-      </w:pPr>
-      <w:r>
-        <w:t>beta_a &lt;- round(coef(model_a)[2], 3)</w:t>
+      <w:proofErr w:type="spellStart"/>
+      <w:r>
+        <w:t>model_a</w:t>
+      </w:r>
+      <w:proofErr w:type="spellEnd"/>
+      <w:r>
+        <w:t xml:space="preserve"> &lt;- </w:t>
+      </w:r>
+      <w:proofErr w:type="spellStart"/>
+      <w:r>
+        <w:t>lm</w:t>
+      </w:r>
+      <w:proofErr w:type="spellEnd"/>
+      <w:r>
+        <w:t>(scale(</w:t>
+      </w:r>
+      <w:proofErr w:type="spellStart"/>
+      <w:r>
+        <w:t>income_num</w:t>
+      </w:r>
+      <w:proofErr w:type="spellEnd"/>
+      <w:r>
+        <w:t>) ~ scale(</w:t>
+      </w:r>
+      <w:proofErr w:type="spellStart"/>
+      <w:r>
+        <w:t>edu_num</w:t>
+      </w:r>
+      <w:proofErr w:type="spellEnd"/>
+      <w:r>
+        <w:t xml:space="preserve">), data = </w:t>
+      </w:r>
+      <w:proofErr w:type="spellStart"/>
+      <w:r>
+        <w:t>gss_med</w:t>
+      </w:r>
+      <w:proofErr w:type="spellEnd"/>
+      <w:r>
+        <w:t>)</w:t>
+      </w:r>
+    </w:p>
+    <w:p>
+      <w:pPr>
+        <w:spacing w:after="0"/>
+      </w:pPr>
+      <w:proofErr w:type="spellStart"/>
+      <w:r>
+        <w:t>beta_a</w:t>
+      </w:r>
+      <w:proofErr w:type="spellEnd"/>
+      <w:r>
+        <w:t xml:space="preserve"> &lt;- round(</w:t>
+      </w:r>
+      <w:proofErr w:type="spellStart"/>
+      <w:r>
+        <w:t>coef</w:t>
+      </w:r>
+      <w:proofErr w:type="spellEnd"/>
+      <w:r>
+        <w:t>(</w:t>
+      </w:r>
+      <w:proofErr w:type="spellStart"/>
+      <w:r>
+        <w:t>model_a</w:t>
+      </w:r>
+      <w:proofErr w:type="spellEnd"/>
+      <w:r>
+        <w:t>)[2], 3)</w:t>
       </w:r>
     </w:p>
     <w:p>
@@ -10887,24 +12468,111 @@
       <w:pPr>
         <w:spacing w:after="0"/>
       </w:pPr>
-      <w:r>
-        <w:t>model_bc &lt;- lm(scale(happy_rev) ~ scale(edu_num) + scale(income_num), data = gss_med)</w:t>
-      </w:r>
-    </w:p>
-    <w:p>
-      <w:pPr>
-        <w:spacing w:after="0"/>
-      </w:pPr>
-      <w:r>
-        <w:t>beta_c_prime &lt;- round(coef(model_bc)[2], 3) # Direct effect</w:t>
-      </w:r>
-    </w:p>
-    <w:p>
-      <w:pPr>
-        <w:spacing w:after="0"/>
-      </w:pPr>
-      <w:r>
-        <w:t>beta_b &lt;- round(coef(model_bc)[3], 3)       # Mediator effect</w:t>
+      <w:proofErr w:type="spellStart"/>
+      <w:r>
+        <w:t>model_bc</w:t>
+      </w:r>
+      <w:proofErr w:type="spellEnd"/>
+      <w:r>
+        <w:t xml:space="preserve"> &lt;- </w:t>
+      </w:r>
+      <w:proofErr w:type="spellStart"/>
+      <w:r>
+        <w:t>lm</w:t>
+      </w:r>
+      <w:proofErr w:type="spellEnd"/>
+      <w:r>
+        <w:t>(scale(</w:t>
+      </w:r>
+      <w:proofErr w:type="spellStart"/>
+      <w:r>
+        <w:t>happy_rev</w:t>
+      </w:r>
+      <w:proofErr w:type="spellEnd"/>
+      <w:r>
+        <w:t>) ~ scale(</w:t>
+      </w:r>
+      <w:proofErr w:type="spellStart"/>
+      <w:r>
+        <w:t>edu_num</w:t>
+      </w:r>
+      <w:proofErr w:type="spellEnd"/>
+      <w:r>
+        <w:t>) + scale(</w:t>
+      </w:r>
+      <w:proofErr w:type="spellStart"/>
+      <w:r>
+        <w:t>income_num</w:t>
+      </w:r>
+      <w:proofErr w:type="spellEnd"/>
+      <w:r>
+        <w:t xml:space="preserve">), data = </w:t>
+      </w:r>
+      <w:proofErr w:type="spellStart"/>
+      <w:r>
+        <w:t>gss_med</w:t>
+      </w:r>
+      <w:proofErr w:type="spellEnd"/>
+      <w:r>
+        <w:t>)</w:t>
+      </w:r>
+    </w:p>
+    <w:p>
+      <w:pPr>
+        <w:spacing w:after="0"/>
+      </w:pPr>
+      <w:proofErr w:type="spellStart"/>
+      <w:r>
+        <w:t>beta_c_prime</w:t>
+      </w:r>
+      <w:proofErr w:type="spellEnd"/>
+      <w:r>
+        <w:t xml:space="preserve"> &lt;- round(</w:t>
+      </w:r>
+      <w:proofErr w:type="spellStart"/>
+      <w:r>
+        <w:t>coef</w:t>
+      </w:r>
+      <w:proofErr w:type="spellEnd"/>
+      <w:r>
+        <w:t>(</w:t>
+      </w:r>
+      <w:proofErr w:type="spellStart"/>
+      <w:r>
+        <w:t>model_bc</w:t>
+      </w:r>
+      <w:proofErr w:type="spellEnd"/>
+      <w:r>
+        <w:t>)[2], 3) # Direct effect</w:t>
+      </w:r>
+    </w:p>
+    <w:p>
+      <w:pPr>
+        <w:spacing w:after="0"/>
+      </w:pPr>
+      <w:proofErr w:type="spellStart"/>
+      <w:r>
+        <w:t>beta_b</w:t>
+      </w:r>
+      <w:proofErr w:type="spellEnd"/>
+      <w:r>
+        <w:t xml:space="preserve"> &lt;- round(</w:t>
+      </w:r>
+      <w:proofErr w:type="spellStart"/>
+      <w:r>
+        <w:t>coef</w:t>
+      </w:r>
+      <w:proofErr w:type="spellEnd"/>
+      <w:r>
+        <w:t>(</w:t>
+      </w:r>
+      <w:proofErr w:type="spellStart"/>
+      <w:r>
+        <w:t>model_bc</w:t>
+      </w:r>
+      <w:proofErr w:type="spellEnd"/>
+      <w:r>
+        <w:t>)[3], 3)       # Mediator effect</w:t>
       </w:r>
     </w:p>
     <w:p>
@@ -10925,33 +12593,86 @@
         <w:spacing w:after="0"/>
       </w:pPr>
       <w:r>
-        <w:t>cat("Path a:", beta_a, "\nPath b:", beta_b, "\nPath c':", beta_c_prime)</w:t>
-      </w:r>
-    </w:p>
-    <w:p>
-      <w:pPr>
-        <w:spacing w:after="0"/>
-      </w:pPr>
-    </w:p>
-    <w:p>
-      <w:pPr>
-        <w:spacing w:after="0"/>
-      </w:pPr>
-      <w:r>
-        <w:t>library(DiagrammeR)</w:t>
-      </w:r>
-    </w:p>
-    <w:p>
-      <w:pPr>
-        <w:spacing w:after="0"/>
-      </w:pPr>
-    </w:p>
-    <w:p>
-      <w:pPr>
-        <w:spacing w:after="0"/>
-      </w:pPr>
-      <w:r>
-        <w:t>grViz("</w:t>
+        <w:t xml:space="preserve">cat("Path a:", </w:t>
+      </w:r>
+      <w:proofErr w:type="spellStart"/>
+      <w:r>
+        <w:t>beta_a</w:t>
+      </w:r>
+      <w:proofErr w:type="spellEnd"/>
+      <w:r>
+        <w:t>, "\</w:t>
+      </w:r>
+      <w:proofErr w:type="spellStart"/>
+      <w:r>
+        <w:t>nPath</w:t>
+      </w:r>
+      <w:proofErr w:type="spellEnd"/>
+      <w:r>
+        <w:t xml:space="preserve"> b:", </w:t>
+      </w:r>
+      <w:proofErr w:type="spellStart"/>
+      <w:r>
+        <w:t>beta_b</w:t>
+      </w:r>
+      <w:proofErr w:type="spellEnd"/>
+      <w:r>
+        <w:t>, "\</w:t>
+      </w:r>
+      <w:proofErr w:type="spellStart"/>
+      <w:r>
+        <w:t>nPath</w:t>
+      </w:r>
+      <w:proofErr w:type="spellEnd"/>
+      <w:r>
+        <w:t xml:space="preserve"> c':", </w:t>
+      </w:r>
+      <w:proofErr w:type="spellStart"/>
+      <w:r>
+        <w:t>beta_c_prime</w:t>
+      </w:r>
+      <w:proofErr w:type="spellEnd"/>
+      <w:r>
+        <w:t>)</w:t>
+      </w:r>
+    </w:p>
+    <w:p>
+      <w:pPr>
+        <w:spacing w:after="0"/>
+      </w:pPr>
+    </w:p>
+    <w:p>
+      <w:pPr>
+        <w:spacing w:after="0"/>
+      </w:pPr>
+      <w:r>
+        <w:t>library(</w:t>
+      </w:r>
+      <w:proofErr w:type="spellStart"/>
+      <w:r>
+        <w:t>DiagrammeR</w:t>
+      </w:r>
+      <w:proofErr w:type="spellEnd"/>
+      <w:r>
+        <w:t>)</w:t>
+      </w:r>
+    </w:p>
+    <w:p>
+      <w:pPr>
+        <w:spacing w:after="0"/>
+      </w:pPr>
+    </w:p>
+    <w:p>
+      <w:pPr>
+        <w:spacing w:after="0"/>
+      </w:pPr>
+      <w:proofErr w:type="spellStart"/>
+      <w:r>
+        <w:t>grViz</w:t>
+      </w:r>
+      <w:proofErr w:type="spellEnd"/>
+      <w:r>
+        <w:t>("</w:t>
       </w:r>
     </w:p>
     <w:p>
@@ -10975,15 +12696,39 @@
         <w:spacing w:after="0"/>
       </w:pPr>
       <w:r>
-        <w:t xml:space="preserve">    graph [layout = dot, rankdir = LR]</w:t>
-      </w:r>
-    </w:p>
-    <w:p>
-      <w:pPr>
-        <w:spacing w:after="0"/>
-      </w:pPr>
-      <w:r>
-        <w:t xml:space="preserve">    node [shape = box, fontname = Helvetica, penwidth = 2]</w:t>
+        <w:t xml:space="preserve">    graph [layout = dot, </w:t>
+      </w:r>
+      <w:proofErr w:type="spellStart"/>
+      <w:r>
+        <w:t>rankdir</w:t>
+      </w:r>
+      <w:proofErr w:type="spellEnd"/>
+      <w:r>
+        <w:t xml:space="preserve"> = LR]</w:t>
+      </w:r>
+    </w:p>
+    <w:p>
+      <w:pPr>
+        <w:spacing w:after="0"/>
+      </w:pPr>
+      <w:r>
+        <w:t xml:space="preserve">    node [shape = box, </w:t>
+      </w:r>
+      <w:proofErr w:type="spellStart"/>
+      <w:r>
+        <w:t>fontname</w:t>
+      </w:r>
+      <w:proofErr w:type="spellEnd"/>
+      <w:r>
+        <w:t xml:space="preserve"> = Helvetica, </w:t>
+      </w:r>
+      <w:proofErr w:type="spellStart"/>
+      <w:r>
+        <w:t>penwidth</w:t>
+      </w:r>
+      <w:proofErr w:type="spellEnd"/>
+      <w:r>
+        <w:t xml:space="preserve"> = 2]</w:t>
       </w:r>
     </w:p>
     <w:p>
@@ -11116,7 +12861,23 @@
         <w:spacing w:after="0"/>
       </w:pPr>
       <w:r>
-        <w:t xml:space="preserve">    edge [fontname = Helvetica, fontsize = 10]</w:t>
+        <w:t xml:space="preserve">    edge [</w:t>
+      </w:r>
+      <w:proofErr w:type="spellStart"/>
+      <w:r>
+        <w:t>fontname</w:t>
+      </w:r>
+      <w:proofErr w:type="spellEnd"/>
+      <w:r>
+        <w:t xml:space="preserve"> = Helvetica, </w:t>
+      </w:r>
+      <w:proofErr w:type="spellStart"/>
+      <w:r>
+        <w:t>fontsize</w:t>
+      </w:r>
+      <w:proofErr w:type="spellEnd"/>
+      <w:r>
+        <w:t xml:space="preserve"> = 10]</w:t>
       </w:r>
     </w:p>
     <w:p>
@@ -11201,7 +12962,15 @@
         <w:spacing w:after="0"/>
       </w:pPr>
       <w:r>
-        <w:t>library(tidyverse)</w:t>
+        <w:t>library(</w:t>
+      </w:r>
+      <w:proofErr w:type="spellStart"/>
+      <w:r>
+        <w:t>tidyverse</w:t>
+      </w:r>
+      <w:proofErr w:type="spellEnd"/>
+      <w:r>
+        <w:t>)</w:t>
       </w:r>
     </w:p>
     <w:p>
@@ -11225,7 +12994,15 @@
         <w:spacing w:after="0"/>
       </w:pPr>
       <w:r>
-        <w:t>library(sjPlot)</w:t>
+        <w:t>library(</w:t>
+      </w:r>
+      <w:proofErr w:type="spellStart"/>
+      <w:r>
+        <w:t>sjPlot</w:t>
+      </w:r>
+      <w:proofErr w:type="spellEnd"/>
+      <w:r>
+        <w:t>)</w:t>
       </w:r>
     </w:p>
     <w:p>
@@ -11245,8 +13022,21 @@
       <w:pPr>
         <w:spacing w:after="0"/>
       </w:pPr>
-      <w:r>
-        <w:t>setwd("C:/Users/Owner/Documents/BallState/DSCI-609 SocSci/Paper")</w:t>
+      <w:proofErr w:type="spellStart"/>
+      <w:r>
+        <w:t>setwd</w:t>
+      </w:r>
+      <w:proofErr w:type="spellEnd"/>
+      <w:r>
+        <w:t xml:space="preserve">("C:/Users/Owner/Documents/BallState/DSCI-609 </w:t>
+      </w:r>
+      <w:proofErr w:type="spellStart"/>
+      <w:r>
+        <w:t>SocSci</w:t>
+      </w:r>
+      <w:proofErr w:type="spellEnd"/>
+      <w:r>
+        <w:t>/Paper")</w:t>
       </w:r>
     </w:p>
     <w:p>
@@ -11266,8 +13056,13 @@
       <w:pPr>
         <w:spacing w:after="0"/>
       </w:pPr>
-      <w:r>
-        <w:t>oecd_raw &lt;- read.csv("oced_bli.csv")</w:t>
+      <w:proofErr w:type="spellStart"/>
+      <w:r>
+        <w:t>oecd_raw</w:t>
+      </w:r>
+      <w:proofErr w:type="spellEnd"/>
+      <w:r>
+        <w:t xml:space="preserve"> &lt;- read.csv("oced_bli.csv")</w:t>
       </w:r>
     </w:p>
     <w:p>
@@ -11295,16 +13090,37 @@
       <w:pPr>
         <w:spacing w:after="0"/>
       </w:pPr>
-      <w:r>
-        <w:t>region_map &lt;- data.frame(</w:t>
-      </w:r>
-    </w:p>
-    <w:p>
-      <w:pPr>
-        <w:spacing w:after="0"/>
-      </w:pPr>
-      <w:r>
-        <w:t xml:space="preserve">  country_name = c(</w:t>
+      <w:proofErr w:type="spellStart"/>
+      <w:r>
+        <w:t>region_map</w:t>
+      </w:r>
+      <w:proofErr w:type="spellEnd"/>
+      <w:r>
+        <w:t xml:space="preserve"> &lt;- </w:t>
+      </w:r>
+      <w:proofErr w:type="spellStart"/>
+      <w:r>
+        <w:t>data.frame</w:t>
+      </w:r>
+      <w:proofErr w:type="spellEnd"/>
+      <w:r>
+        <w:t>(</w:t>
+      </w:r>
+    </w:p>
+    <w:p>
+      <w:pPr>
+        <w:spacing w:after="0"/>
+      </w:pPr>
+      <w:r>
+        <w:t xml:space="preserve">  </w:t>
+      </w:r>
+      <w:proofErr w:type="spellStart"/>
+      <w:r>
+        <w:t>country_name</w:t>
+      </w:r>
+      <w:proofErr w:type="spellEnd"/>
+      <w:r>
+        <w:t xml:space="preserve"> = c(</w:t>
       </w:r>
     </w:p>
     <w:p>
@@ -11525,15 +13341,31 @@
         <w:spacing w:after="0"/>
       </w:pPr>
       <w:r>
-        <w:t>batch_5_data &lt;- oecd_raw %&gt;%</w:t>
-      </w:r>
-    </w:p>
-    <w:p>
-      <w:pPr>
-        <w:spacing w:after="0"/>
-      </w:pPr>
-      <w:r>
-        <w:t xml:space="preserve">  dplyr::filter(</w:t>
+        <w:t xml:space="preserve">batch_5_data &lt;- </w:t>
+      </w:r>
+      <w:proofErr w:type="spellStart"/>
+      <w:r>
+        <w:t>oecd_raw</w:t>
+      </w:r>
+      <w:proofErr w:type="spellEnd"/>
+      <w:r>
+        <w:t xml:space="preserve"> %&gt;%</w:t>
+      </w:r>
+    </w:p>
+    <w:p>
+      <w:pPr>
+        <w:spacing w:after="0"/>
+      </w:pPr>
+      <w:r>
+        <w:t xml:space="preserve">  </w:t>
+      </w:r>
+      <w:proofErr w:type="spellStart"/>
+      <w:r>
+        <w:t>dplyr</w:t>
+      </w:r>
+      <w:proofErr w:type="spellEnd"/>
+      <w:r>
+        <w:t>::filter(</w:t>
       </w:r>
     </w:p>
     <w:p>
@@ -11613,71 +13445,167 @@
         <w:spacing w:after="0"/>
       </w:pPr>
       <w:r>
-        <w:t xml:space="preserve">  dplyr::select(Country, Indicator, OBS_VALUE) %&gt;%</w:t>
-      </w:r>
-    </w:p>
-    <w:p>
-      <w:pPr>
-        <w:spacing w:after="0"/>
-      </w:pPr>
-      <w:r>
-        <w:t xml:space="preserve">  tidyr::pivot_wider(names_from = Indicator, values_from = OBS_VALUE) %&gt;%</w:t>
-      </w:r>
-    </w:p>
-    <w:p>
-      <w:pPr>
-        <w:spacing w:after="0"/>
-      </w:pPr>
-      <w:r>
-        <w:t xml:space="preserve">  dplyr::rename(</w:t>
-      </w:r>
-    </w:p>
-    <w:p>
-      <w:pPr>
-        <w:spacing w:after="0"/>
-      </w:pPr>
-      <w:r>
-        <w:t xml:space="preserve">    country_name = Country,</w:t>
-      </w:r>
-    </w:p>
-    <w:p>
-      <w:pPr>
-        <w:spacing w:after="0"/>
-      </w:pPr>
-      <w:r>
-        <w:t xml:space="preserve">    life_satisfaction = `Life satisfaction`,</w:t>
-      </w:r>
-    </w:p>
-    <w:p>
-      <w:pPr>
-        <w:spacing w:after="0"/>
-      </w:pPr>
-      <w:r>
-        <w:t xml:space="preserve">    social_support = `Quality of support network`,</w:t>
-      </w:r>
-    </w:p>
-    <w:p>
-      <w:pPr>
-        <w:spacing w:after="0"/>
-      </w:pPr>
-      <w:r>
-        <w:t xml:space="preserve">    employment_rate = `Employment rate`,</w:t>
-      </w:r>
-    </w:p>
-    <w:p>
-      <w:pPr>
-        <w:spacing w:after="0"/>
-      </w:pPr>
-      <w:r>
-        <w:t xml:space="preserve">    GDP_per_capita = `Household net adjusted disposable income`,</w:t>
-      </w:r>
-    </w:p>
-    <w:p>
-      <w:pPr>
-        <w:spacing w:after="0"/>
-      </w:pPr>
-      <w:r>
-        <w:t xml:space="preserve">    housing_affordability = `Housing expenditure`</w:t>
+        <w:t xml:space="preserve">  </w:t>
+      </w:r>
+      <w:proofErr w:type="spellStart"/>
+      <w:r>
+        <w:t>dplyr</w:t>
+      </w:r>
+      <w:proofErr w:type="spellEnd"/>
+      <w:r>
+        <w:t>::select(Country, Indicator, OBS_VALUE) %&gt;%</w:t>
+      </w:r>
+    </w:p>
+    <w:p>
+      <w:pPr>
+        <w:spacing w:after="0"/>
+      </w:pPr>
+      <w:r>
+        <w:t xml:space="preserve">  </w:t>
+      </w:r>
+      <w:proofErr w:type="spellStart"/>
+      <w:r>
+        <w:t>tidyr</w:t>
+      </w:r>
+      <w:proofErr w:type="spellEnd"/>
+      <w:r>
+        <w:t>::</w:t>
+      </w:r>
+      <w:proofErr w:type="spellStart"/>
+      <w:r>
+        <w:t>pivot_wider</w:t>
+      </w:r>
+      <w:proofErr w:type="spellEnd"/>
+      <w:r>
+        <w:t>(</w:t>
+      </w:r>
+      <w:proofErr w:type="spellStart"/>
+      <w:r>
+        <w:t>names_from</w:t>
+      </w:r>
+      <w:proofErr w:type="spellEnd"/>
+      <w:r>
+        <w:t xml:space="preserve"> = Indicator, </w:t>
+      </w:r>
+      <w:proofErr w:type="spellStart"/>
+      <w:r>
+        <w:t>values_from</w:t>
+      </w:r>
+      <w:proofErr w:type="spellEnd"/>
+      <w:r>
+        <w:t xml:space="preserve"> = OBS_VALUE) %&gt;%</w:t>
+      </w:r>
+    </w:p>
+    <w:p>
+      <w:pPr>
+        <w:spacing w:after="0"/>
+      </w:pPr>
+      <w:r>
+        <w:t xml:space="preserve">  </w:t>
+      </w:r>
+      <w:proofErr w:type="spellStart"/>
+      <w:r>
+        <w:t>dplyr</w:t>
+      </w:r>
+      <w:proofErr w:type="spellEnd"/>
+      <w:r>
+        <w:t>::rename(</w:t>
+      </w:r>
+    </w:p>
+    <w:p>
+      <w:pPr>
+        <w:spacing w:after="0"/>
+      </w:pPr>
+      <w:r>
+        <w:t xml:space="preserve">    </w:t>
+      </w:r>
+      <w:proofErr w:type="spellStart"/>
+      <w:r>
+        <w:t>country_name</w:t>
+      </w:r>
+      <w:proofErr w:type="spellEnd"/>
+      <w:r>
+        <w:t xml:space="preserve"> = Country,</w:t>
+      </w:r>
+    </w:p>
+    <w:p>
+      <w:pPr>
+        <w:spacing w:after="0"/>
+      </w:pPr>
+      <w:r>
+        <w:t xml:space="preserve">    </w:t>
+      </w:r>
+      <w:proofErr w:type="spellStart"/>
+      <w:r>
+        <w:t>life_satisfaction</w:t>
+      </w:r>
+      <w:proofErr w:type="spellEnd"/>
+      <w:r>
+        <w:t xml:space="preserve"> = `Life satisfaction`,</w:t>
+      </w:r>
+    </w:p>
+    <w:p>
+      <w:pPr>
+        <w:spacing w:after="0"/>
+      </w:pPr>
+      <w:r>
+        <w:t xml:space="preserve">    </w:t>
+      </w:r>
+      <w:proofErr w:type="spellStart"/>
+      <w:r>
+        <w:t>social_support</w:t>
+      </w:r>
+      <w:proofErr w:type="spellEnd"/>
+      <w:r>
+        <w:t xml:space="preserve"> = `Quality of support network`,</w:t>
+      </w:r>
+    </w:p>
+    <w:p>
+      <w:pPr>
+        <w:spacing w:after="0"/>
+      </w:pPr>
+      <w:r>
+        <w:t xml:space="preserve">    </w:t>
+      </w:r>
+      <w:proofErr w:type="spellStart"/>
+      <w:r>
+        <w:t>employment_rate</w:t>
+      </w:r>
+      <w:proofErr w:type="spellEnd"/>
+      <w:r>
+        <w:t xml:space="preserve"> = `Employment rate`,</w:t>
+      </w:r>
+    </w:p>
+    <w:p>
+      <w:pPr>
+        <w:spacing w:after="0"/>
+      </w:pPr>
+      <w:r>
+        <w:t xml:space="preserve">    </w:t>
+      </w:r>
+      <w:proofErr w:type="spellStart"/>
+      <w:r>
+        <w:t>GDP_per_capita</w:t>
+      </w:r>
+      <w:proofErr w:type="spellEnd"/>
+      <w:r>
+        <w:t xml:space="preserve"> = `Household net adjusted disposable income`,</w:t>
+      </w:r>
+    </w:p>
+    <w:p>
+      <w:pPr>
+        <w:spacing w:after="0"/>
+      </w:pPr>
+      <w:r>
+        <w:t xml:space="preserve">    </w:t>
+      </w:r>
+      <w:proofErr w:type="spellStart"/>
+      <w:r>
+        <w:t>housing_affordability</w:t>
+      </w:r>
+      <w:proofErr w:type="spellEnd"/>
+      <w:r>
+        <w:t xml:space="preserve"> = `Housing expenditure`</w:t>
       </w:r>
     </w:p>
     <w:p>
@@ -11693,7 +13621,39 @@
         <w:spacing w:after="0"/>
       </w:pPr>
       <w:r>
-        <w:t xml:space="preserve">  dplyr::left_join(region_map, by = "country_name") %&gt;%</w:t>
+        <w:t xml:space="preserve">  </w:t>
+      </w:r>
+      <w:proofErr w:type="spellStart"/>
+      <w:r>
+        <w:t>dplyr</w:t>
+      </w:r>
+      <w:proofErr w:type="spellEnd"/>
+      <w:r>
+        <w:t>::</w:t>
+      </w:r>
+      <w:proofErr w:type="spellStart"/>
+      <w:r>
+        <w:t>left_join</w:t>
+      </w:r>
+      <w:proofErr w:type="spellEnd"/>
+      <w:r>
+        <w:t>(</w:t>
+      </w:r>
+      <w:proofErr w:type="spellStart"/>
+      <w:r>
+        <w:t>region_map</w:t>
+      </w:r>
+      <w:proofErr w:type="spellEnd"/>
+      <w:r>
+        <w:t>, by = "</w:t>
+      </w:r>
+      <w:proofErr w:type="spellStart"/>
+      <w:r>
+        <w:t>country_name</w:t>
+      </w:r>
+      <w:proofErr w:type="spellEnd"/>
+      <w:r>
+        <w:t>") %&gt;%</w:t>
       </w:r>
     </w:p>
     <w:p>
@@ -11717,7 +13677,55 @@
         <w:spacing w:after="0"/>
       </w:pPr>
       <w:r>
-        <w:t xml:space="preserve">  drop_na(life_satisfaction, social_support, employment_rate, GDP_per_capita, housing_affordability, region)</w:t>
+        <w:t xml:space="preserve">  </w:t>
+      </w:r>
+      <w:proofErr w:type="spellStart"/>
+      <w:r>
+        <w:t>drop_na</w:t>
+      </w:r>
+      <w:proofErr w:type="spellEnd"/>
+      <w:r>
+        <w:t>(</w:t>
+      </w:r>
+      <w:proofErr w:type="spellStart"/>
+      <w:r>
+        <w:t>life_satisfaction</w:t>
+      </w:r>
+      <w:proofErr w:type="spellEnd"/>
+      <w:r>
+        <w:t xml:space="preserve">, </w:t>
+      </w:r>
+      <w:proofErr w:type="spellStart"/>
+      <w:r>
+        <w:t>social_support</w:t>
+      </w:r>
+      <w:proofErr w:type="spellEnd"/>
+      <w:r>
+        <w:t xml:space="preserve">, </w:t>
+      </w:r>
+      <w:proofErr w:type="spellStart"/>
+      <w:r>
+        <w:t>employment_rate</w:t>
+      </w:r>
+      <w:proofErr w:type="spellEnd"/>
+      <w:r>
+        <w:t xml:space="preserve">, </w:t>
+      </w:r>
+      <w:proofErr w:type="spellStart"/>
+      <w:r>
+        <w:t>GDP_per_capita</w:t>
+      </w:r>
+      <w:proofErr w:type="spellEnd"/>
+      <w:r>
+        <w:t xml:space="preserve">, </w:t>
+      </w:r>
+      <w:proofErr w:type="spellStart"/>
+      <w:r>
+        <w:t>housing_affordability</w:t>
+      </w:r>
+      <w:proofErr w:type="spellEnd"/>
+      <w:r>
+        <w:t>, region)</w:t>
       </w:r>
     </w:p>
     <w:p>
@@ -11737,8 +13745,29 @@
       <w:pPr>
         <w:spacing w:after="0"/>
       </w:pPr>
-      <w:r>
-        <w:t>mlm_null &lt;- lmer(life_satisfaction ~ 1 + (1 | region), data = batch_5_data)</w:t>
+      <w:proofErr w:type="spellStart"/>
+      <w:r>
+        <w:t>mlm_null</w:t>
+      </w:r>
+      <w:proofErr w:type="spellEnd"/>
+      <w:r>
+        <w:t xml:space="preserve"> &lt;- </w:t>
+      </w:r>
+      <w:proofErr w:type="spellStart"/>
+      <w:r>
+        <w:t>lmer</w:t>
+      </w:r>
+      <w:proofErr w:type="spellEnd"/>
+      <w:r>
+        <w:t>(</w:t>
+      </w:r>
+      <w:proofErr w:type="spellStart"/>
+      <w:r>
+        <w:t>life_satisfaction</w:t>
+      </w:r>
+      <w:proofErr w:type="spellEnd"/>
+      <w:r>
+        <w:t xml:space="preserve"> ~ 1 + (1 | region), data = batch_5_data)</w:t>
       </w:r>
     </w:p>
     <w:p>
@@ -11754,7 +13783,23 @@
         <w:spacing w:after="0"/>
       </w:pPr>
       <w:r>
-        <w:t>print(performance::icc(mlm_null))</w:t>
+        <w:t>print(performance::</w:t>
+      </w:r>
+      <w:proofErr w:type="spellStart"/>
+      <w:r>
+        <w:t>icc</w:t>
+      </w:r>
+      <w:proofErr w:type="spellEnd"/>
+      <w:r>
+        <w:t>(</w:t>
+      </w:r>
+      <w:proofErr w:type="spellStart"/>
+      <w:r>
+        <w:t>mlm_null</w:t>
+      </w:r>
+      <w:proofErr w:type="spellEnd"/>
+      <w:r>
+        <w:t>))</w:t>
       </w:r>
     </w:p>
     <w:p>
@@ -11774,16 +13819,53 @@
       <w:pPr>
         <w:spacing w:after="0"/>
       </w:pPr>
-      <w:r>
-        <w:t>mlm_final &lt;- lmer(life_satisfaction ~ social_support + (1 | region), data = batch_5_data)</w:t>
-      </w:r>
-    </w:p>
-    <w:p>
-      <w:pPr>
-        <w:spacing w:after="0"/>
-      </w:pPr>
-      <w:r>
-        <w:t>summary(mlm_final)</w:t>
+      <w:proofErr w:type="spellStart"/>
+      <w:r>
+        <w:t>mlm_final</w:t>
+      </w:r>
+      <w:proofErr w:type="spellEnd"/>
+      <w:r>
+        <w:t xml:space="preserve"> &lt;- </w:t>
+      </w:r>
+      <w:proofErr w:type="spellStart"/>
+      <w:r>
+        <w:t>lmer</w:t>
+      </w:r>
+      <w:proofErr w:type="spellEnd"/>
+      <w:r>
+        <w:t>(</w:t>
+      </w:r>
+      <w:proofErr w:type="spellStart"/>
+      <w:r>
+        <w:t>life_satisfaction</w:t>
+      </w:r>
+      <w:proofErr w:type="spellEnd"/>
+      <w:r>
+        <w:t xml:space="preserve"> ~ </w:t>
+      </w:r>
+      <w:proofErr w:type="spellStart"/>
+      <w:r>
+        <w:t>social_support</w:t>
+      </w:r>
+      <w:proofErr w:type="spellEnd"/>
+      <w:r>
+        <w:t xml:space="preserve"> + (1 | region), data = batch_5_data)</w:t>
+      </w:r>
+    </w:p>
+    <w:p>
+      <w:pPr>
+        <w:spacing w:after="0"/>
+      </w:pPr>
+      <w:r>
+        <w:t>summary(</w:t>
+      </w:r>
+      <w:proofErr w:type="spellStart"/>
+      <w:r>
+        <w:t>mlm_final</w:t>
+      </w:r>
+      <w:proofErr w:type="spellEnd"/>
+      <w:r>
+        <w:t>)</w:t>
       </w:r>
     </w:p>
     <w:p>
@@ -11803,16 +13885,53 @@
       <w:pPr>
         <w:spacing w:after="0"/>
       </w:pPr>
-      <w:r>
-        <w:t>plot_model(mlm_final, type = "re", show.values = TRUE, value.offset = .3) +</w:t>
-      </w:r>
-    </w:p>
-    <w:p>
-      <w:pPr>
-        <w:spacing w:after="0"/>
-      </w:pPr>
-      <w:r>
-        <w:t xml:space="preserve">  theme_minimal() +</w:t>
+      <w:proofErr w:type="spellStart"/>
+      <w:r>
+        <w:t>plot_model</w:t>
+      </w:r>
+      <w:proofErr w:type="spellEnd"/>
+      <w:r>
+        <w:t>(</w:t>
+      </w:r>
+      <w:proofErr w:type="spellStart"/>
+      <w:r>
+        <w:t>mlm_final</w:t>
+      </w:r>
+      <w:proofErr w:type="spellEnd"/>
+      <w:r>
+        <w:t xml:space="preserve">, type = "re", </w:t>
+      </w:r>
+      <w:proofErr w:type="spellStart"/>
+      <w:r>
+        <w:t>show.values</w:t>
+      </w:r>
+      <w:proofErr w:type="spellEnd"/>
+      <w:r>
+        <w:t xml:space="preserve"> = TRUE, </w:t>
+      </w:r>
+      <w:proofErr w:type="spellStart"/>
+      <w:r>
+        <w:t>value.offset</w:t>
+      </w:r>
+      <w:proofErr w:type="spellEnd"/>
+      <w:r>
+        <w:t xml:space="preserve"> = .3) +</w:t>
+      </w:r>
+    </w:p>
+    <w:p>
+      <w:pPr>
+        <w:spacing w:after="0"/>
+      </w:pPr>
+      <w:r>
+        <w:t xml:space="preserve">  </w:t>
+      </w:r>
+      <w:proofErr w:type="spellStart"/>
+      <w:r>
+        <w:t>theme_minimal</w:t>
+      </w:r>
+      <w:proofErr w:type="spellEnd"/>
+      <w:r>
+        <w:t>() +</w:t>
       </w:r>
     </w:p>
     <w:p>
@@ -11876,7 +13995,31 @@
         <w:spacing w:after="0"/>
       </w:pPr>
       <w:r>
-        <w:t xml:space="preserve">  geom_hline(yintercept = 0, linetype = "dashed", color = "red")</w:t>
+        <w:t xml:space="preserve">  </w:t>
+      </w:r>
+      <w:proofErr w:type="spellStart"/>
+      <w:r>
+        <w:t>geom_hline</w:t>
+      </w:r>
+      <w:proofErr w:type="spellEnd"/>
+      <w:r>
+        <w:t>(</w:t>
+      </w:r>
+      <w:proofErr w:type="spellStart"/>
+      <w:r>
+        <w:t>yintercept</w:t>
+      </w:r>
+      <w:proofErr w:type="spellEnd"/>
+      <w:r>
+        <w:t xml:space="preserve"> = 0, </w:t>
+      </w:r>
+      <w:proofErr w:type="spellStart"/>
+      <w:r>
+        <w:t>linetype</w:t>
+      </w:r>
+      <w:proofErr w:type="spellEnd"/>
+      <w:r>
+        <w:t xml:space="preserve"> = "dashed", color = "red")</w:t>
       </w:r>
     </w:p>
     <w:p>
@@ -11921,7 +14064,15 @@
         <w:spacing w:after="0"/>
       </w:pPr>
       <w:r>
-        <w:t>library(tidyverse)</w:t>
+        <w:t>library(</w:t>
+      </w:r>
+      <w:proofErr w:type="spellStart"/>
+      <w:r>
+        <w:t>tidyverse</w:t>
+      </w:r>
+      <w:proofErr w:type="spellEnd"/>
+      <w:r>
+        <w:t>)</w:t>
       </w:r>
     </w:p>
     <w:p>
@@ -11957,57 +14108,107 @@
       <w:pPr>
         <w:spacing w:after="0"/>
       </w:pPr>
-      <w:r>
-        <w:t>efa_data &lt;- batch_5_data %&gt;%</w:t>
-      </w:r>
-    </w:p>
-    <w:p>
-      <w:pPr>
-        <w:spacing w:after="0"/>
-      </w:pPr>
-      <w:r>
-        <w:t xml:space="preserve">  dplyr::select(</w:t>
-      </w:r>
-    </w:p>
-    <w:p>
-      <w:pPr>
-        <w:spacing w:after="0"/>
-      </w:pPr>
-      <w:r>
-        <w:t xml:space="preserve">    GDP_per_capita, </w:t>
-      </w:r>
-    </w:p>
-    <w:p>
-      <w:pPr>
-        <w:spacing w:after="0"/>
-      </w:pPr>
-      <w:r>
-        <w:t xml:space="preserve">    housing_affordability, </w:t>
-      </w:r>
-    </w:p>
-    <w:p>
-      <w:pPr>
-        <w:spacing w:after="0"/>
-      </w:pPr>
-      <w:r>
-        <w:t xml:space="preserve">    employment_rate, </w:t>
-      </w:r>
-    </w:p>
-    <w:p>
-      <w:pPr>
-        <w:spacing w:after="0"/>
-      </w:pPr>
-      <w:r>
-        <w:t xml:space="preserve">    social_support, </w:t>
-      </w:r>
-    </w:p>
-    <w:p>
-      <w:pPr>
-        <w:spacing w:after="0"/>
-      </w:pPr>
-      <w:r>
-        <w:t xml:space="preserve">    life_satisfaction</w:t>
-      </w:r>
+      <w:proofErr w:type="spellStart"/>
+      <w:r>
+        <w:t>efa_data</w:t>
+      </w:r>
+      <w:proofErr w:type="spellEnd"/>
+      <w:r>
+        <w:t xml:space="preserve"> &lt;- batch_5_data %&gt;%</w:t>
+      </w:r>
+    </w:p>
+    <w:p>
+      <w:pPr>
+        <w:spacing w:after="0"/>
+      </w:pPr>
+      <w:r>
+        <w:t xml:space="preserve">  </w:t>
+      </w:r>
+      <w:proofErr w:type="spellStart"/>
+      <w:r>
+        <w:t>dplyr</w:t>
+      </w:r>
+      <w:proofErr w:type="spellEnd"/>
+      <w:r>
+        <w:t>::select(</w:t>
+      </w:r>
+    </w:p>
+    <w:p>
+      <w:pPr>
+        <w:spacing w:after="0"/>
+      </w:pPr>
+      <w:r>
+        <w:t xml:space="preserve">    </w:t>
+      </w:r>
+      <w:proofErr w:type="spellStart"/>
+      <w:r>
+        <w:t>GDP_per_capita</w:t>
+      </w:r>
+      <w:proofErr w:type="spellEnd"/>
+      <w:r>
+        <w:t xml:space="preserve">, </w:t>
+      </w:r>
+    </w:p>
+    <w:p>
+      <w:pPr>
+        <w:spacing w:after="0"/>
+      </w:pPr>
+      <w:r>
+        <w:t xml:space="preserve">    </w:t>
+      </w:r>
+      <w:proofErr w:type="spellStart"/>
+      <w:r>
+        <w:t>housing_affordability</w:t>
+      </w:r>
+      <w:proofErr w:type="spellEnd"/>
+      <w:r>
+        <w:t xml:space="preserve">, </w:t>
+      </w:r>
+    </w:p>
+    <w:p>
+      <w:pPr>
+        <w:spacing w:after="0"/>
+      </w:pPr>
+      <w:r>
+        <w:t xml:space="preserve">    </w:t>
+      </w:r>
+      <w:proofErr w:type="spellStart"/>
+      <w:r>
+        <w:t>employment_rate</w:t>
+      </w:r>
+      <w:proofErr w:type="spellEnd"/>
+      <w:r>
+        <w:t xml:space="preserve">, </w:t>
+      </w:r>
+    </w:p>
+    <w:p>
+      <w:pPr>
+        <w:spacing w:after="0"/>
+      </w:pPr>
+      <w:r>
+        <w:t xml:space="preserve">    </w:t>
+      </w:r>
+      <w:proofErr w:type="spellStart"/>
+      <w:r>
+        <w:t>social_support</w:t>
+      </w:r>
+      <w:proofErr w:type="spellEnd"/>
+      <w:r>
+        <w:t xml:space="preserve">, </w:t>
+      </w:r>
+    </w:p>
+    <w:p>
+      <w:pPr>
+        <w:spacing w:after="0"/>
+      </w:pPr>
+      <w:r>
+        <w:t xml:space="preserve">    </w:t>
+      </w:r>
+      <w:proofErr w:type="spellStart"/>
+      <w:r>
+        <w:t>life_satisfaction</w:t>
+      </w:r>
+      <w:proofErr w:type="spellEnd"/>
     </w:p>
     <w:p>
       <w:pPr>
@@ -12035,15 +14236,47 @@
         <w:spacing w:after="0"/>
       </w:pPr>
       <w:r>
-        <w:t>print(KMO(cor(efa_data)))</w:t>
-      </w:r>
-    </w:p>
-    <w:p>
-      <w:pPr>
-        <w:spacing w:after="0"/>
-      </w:pPr>
-      <w:r>
-        <w:t>print(bartlett.test(efa_data))</w:t>
+        <w:t>print(KMO(</w:t>
+      </w:r>
+      <w:proofErr w:type="spellStart"/>
+      <w:r>
+        <w:t>cor</w:t>
+      </w:r>
+      <w:proofErr w:type="spellEnd"/>
+      <w:r>
+        <w:t>(</w:t>
+      </w:r>
+      <w:proofErr w:type="spellStart"/>
+      <w:r>
+        <w:t>efa_data</w:t>
+      </w:r>
+      <w:proofErr w:type="spellEnd"/>
+      <w:r>
+        <w:t>)))</w:t>
+      </w:r>
+    </w:p>
+    <w:p>
+      <w:pPr>
+        <w:spacing w:after="0"/>
+      </w:pPr>
+      <w:r>
+        <w:t>print(</w:t>
+      </w:r>
+      <w:proofErr w:type="spellStart"/>
+      <w:r>
+        <w:t>bartlett.test</w:t>
+      </w:r>
+      <w:proofErr w:type="spellEnd"/>
+      <w:r>
+        <w:t>(</w:t>
+      </w:r>
+      <w:proofErr w:type="spellStart"/>
+      <w:r>
+        <w:t>efa_data</w:t>
+      </w:r>
+      <w:proofErr w:type="spellEnd"/>
+      <w:r>
+        <w:t>))</w:t>
       </w:r>
     </w:p>
     <w:p>
@@ -12064,31 +14297,76 @@
         <w:spacing w:after="0"/>
       </w:pPr>
       <w:r>
-        <w:t># n.iter = 100 runs a simulation to show where 'random' factors would fall</w:t>
-      </w:r>
-    </w:p>
-    <w:p>
-      <w:pPr>
-        <w:spacing w:after="0"/>
-      </w:pPr>
-      <w:r>
-        <w:t>parallel_results &lt;- fa.parallel(</w:t>
-      </w:r>
-    </w:p>
-    <w:p>
-      <w:pPr>
-        <w:spacing w:after="0"/>
-      </w:pPr>
-      <w:r>
-        <w:t xml:space="preserve">  efa_data, </w:t>
-      </w:r>
-    </w:p>
-    <w:p>
-      <w:pPr>
-        <w:spacing w:after="0"/>
-      </w:pPr>
-      <w:r>
-        <w:t xml:space="preserve">  fm = "minres", # Minimum Residual factor method</w:t>
+        <w:t xml:space="preserve"># </w:t>
+      </w:r>
+      <w:proofErr w:type="spellStart"/>
+      <w:r>
+        <w:t>n.iter</w:t>
+      </w:r>
+      <w:proofErr w:type="spellEnd"/>
+      <w:r>
+        <w:t xml:space="preserve"> = 100 runs a simulation to show where 'random' factors would fall</w:t>
+      </w:r>
+    </w:p>
+    <w:p>
+      <w:pPr>
+        <w:spacing w:after="0"/>
+      </w:pPr>
+      <w:proofErr w:type="spellStart"/>
+      <w:r>
+        <w:t>parallel_results</w:t>
+      </w:r>
+      <w:proofErr w:type="spellEnd"/>
+      <w:r>
+        <w:t xml:space="preserve"> &lt;- </w:t>
+      </w:r>
+      <w:proofErr w:type="spellStart"/>
+      <w:r>
+        <w:t>fa.parallel</w:t>
+      </w:r>
+      <w:proofErr w:type="spellEnd"/>
+      <w:r>
+        <w:t>(</w:t>
+      </w:r>
+    </w:p>
+    <w:p>
+      <w:pPr>
+        <w:spacing w:after="0"/>
+      </w:pPr>
+      <w:r>
+        <w:t xml:space="preserve">  </w:t>
+      </w:r>
+      <w:proofErr w:type="spellStart"/>
+      <w:r>
+        <w:t>efa_data</w:t>
+      </w:r>
+      <w:proofErr w:type="spellEnd"/>
+      <w:r>
+        <w:t xml:space="preserve">, </w:t>
+      </w:r>
+    </w:p>
+    <w:p>
+      <w:pPr>
+        <w:spacing w:after="0"/>
+      </w:pPr>
+      <w:r>
+        <w:t xml:space="preserve">  </w:t>
+      </w:r>
+      <w:proofErr w:type="spellStart"/>
+      <w:r>
+        <w:t>fm</w:t>
+      </w:r>
+      <w:proofErr w:type="spellEnd"/>
+      <w:r>
+        <w:t xml:space="preserve"> = "</w:t>
+      </w:r>
+      <w:proofErr w:type="spellStart"/>
+      <w:r>
+        <w:t>minres</w:t>
+      </w:r>
+      <w:proofErr w:type="spellEnd"/>
+      <w:r>
+        <w:t>", # Minimum Residual factor method</w:t>
       </w:r>
     </w:p>
     <w:p>
@@ -12104,7 +14382,15 @@
         <w:spacing w:after="0"/>
       </w:pPr>
       <w:r>
-        <w:t xml:space="preserve">  n.iter = 100, </w:t>
+        <w:t xml:space="preserve">  </w:t>
+      </w:r>
+      <w:proofErr w:type="spellStart"/>
+      <w:r>
+        <w:t>n.iter</w:t>
+      </w:r>
+      <w:proofErr w:type="spellEnd"/>
+      <w:r>
+        <w:t xml:space="preserve"> = 100, </w:t>
       </w:r>
     </w:p>
     <w:p>
@@ -12140,8 +14426,21 @@
       <w:pPr>
         <w:spacing w:after="0"/>
       </w:pPr>
-      <w:r>
-        <w:t>abline(h = 1, col = "red", lty = 2)</w:t>
+      <w:proofErr w:type="spellStart"/>
+      <w:r>
+        <w:t>abline</w:t>
+      </w:r>
+      <w:proofErr w:type="spellEnd"/>
+      <w:r>
+        <w:t xml:space="preserve">(h = 1, col = "red", </w:t>
+      </w:r>
+      <w:proofErr w:type="spellStart"/>
+      <w:r>
+        <w:t>lty</w:t>
+      </w:r>
+      <w:proofErr w:type="spellEnd"/>
+      <w:r>
+        <w:t xml:space="preserve"> = 2)</w:t>
       </w:r>
     </w:p>
     <w:p>

</xml_diff>